<commit_message>
fix: reconstrói modelos oficiais para impressão
</commit_message>
<xml_diff>
--- a/public/templates/official/exumacao/ordem-exumacao.docx
+++ b/public/templates/official/exumacao/ordem-exumacao.docx
@@ -29,20 +29,27 @@
       </w:tblGrid>
       <w:tr>
         <w:trPr>
-          <w:trHeight w:val="273" w:hRule="atLeast"/>
+          <w:trHeight w:val="255" w:hRule="atLeast"/>
         </w:trPr>
         <w:tc>
           <w:tcPr>
             <w:tcW w:w="10059" w:type="dxa"/>
             <w:gridSpan w:val="8"/>
             <w:tcBorders/>
+            <w:tcMar>
+              <w:top w:w="40" w:type="dxa"/>
+              <w:start w:w="50" w:type="dxa"/>
+              <w:bottom w:w="40" w:type="dxa"/>
+              <w:end w:w="50" w:type="dxa"/>
+            </w:tcMar>
+            <w:vAlign w:val="center"/>
           </w:tcPr>
           <w:p>
             <w:pPr>
               <w:pStyle w:val="Normal"/>
               <w:widowControl/>
               <w:suppressAutoHyphens w:val="true"/>
-              <w:spacing w:before="0" w:after="0"/>
+              <w:spacing w:before="0" w:after="0" w:line="240" w:lineRule="auto"/>
               <w:jc w:val="center"/>
               <w:rPr>
                 <w:rFonts w:ascii="Arial" w:hAnsi="Arial" w:cs="Arial"/>
@@ -52,7 +59,7 @@
             </w:pPr>
             <w:r>
               <w:rPr>
-                <w:rFonts w:eastAsia="Times New Roman" w:cs="Arial" w:ascii="Arial" w:hAnsi="Arial"/>
+                <w:rFonts w:eastAsia="Arial" w:cs="Arial" w:ascii="Arial" w:hAnsi="Arial"/>
                 <w:b/>
                 <w:bCs/>
                 <w:kern w:val="0"/>
@@ -67,217 +74,47 @@
       </w:tr>
       <w:tr>
         <w:trPr>
-          <w:trHeight w:val="800" w:hRule="atLeast"/>
+          <w:trHeight w:val="539" w:hRule="atLeast"/>
         </w:trPr>
         <w:tc>
           <w:tcPr>
             <w:tcW w:w="4064" w:type="dxa"/>
             <w:gridSpan w:val="2"/>
             <w:tcBorders/>
+            <w:tcMar>
+              <w:top w:w="40" w:type="dxa"/>
+              <w:start w:w="50" w:type="dxa"/>
+              <w:bottom w:w="40" w:type="dxa"/>
+              <w:end w:w="50" w:type="dxa"/>
+            </w:tcMar>
+            <w:vAlign w:val="center"/>
           </w:tcPr>
           <w:p>
             <w:pPr>
-              <w:pStyle w:val="Normal"/>
-              <w:widowControl/>
-              <w:suppressAutoHyphens w:val="true"/>
-              <w:spacing w:before="0" w:after="0"/>
+              <w:keepNext w:val="0"/>
+              <w:spacing w:before="0" w:after="0" w:line="240" w:lineRule="auto"/>
               <w:jc w:val="center"/>
-              <w:rPr>
-                <w:rFonts w:ascii="Arial" w:hAnsi="Arial" w:cs="Arial"/>
-              </w:rPr>
             </w:pPr>
             <w:r>
               <w:rPr>
-                <w:rFonts w:eastAsia="Times New Roman" w:cs="Arial" w:ascii="Arial" w:hAnsi="Arial"/>
-                <w:kern w:val="0"/>
-                <w:sz w:val="20"/>
-                <w:szCs w:val="20"/>
-                <w:lang w:val="pt-BR" w:eastAsia="pt-BR" w:bidi="ar-SA"/>
+                <w:rFonts w:ascii="Arial" w:hAnsi="Arial" w:eastAsia="Arial" w:cs="Arial"/>
+                <w:sz w:val="18"/>
               </w:rPr>
               <w:t>Concessão:</w:t>
             </w:r>
           </w:p>
           <w:p>
             <w:pPr>
-              <w:pStyle w:val="Normal"/>
-              <w:widowControl/>
-              <w:suppressAutoHyphens w:val="true"/>
-              <w:spacing w:before="0" w:after="0"/>
+              <w:keepNext w:val="0"/>
+              <w:spacing w:before="0" w:after="0" w:line="240" w:lineRule="auto"/>
               <w:jc w:val="center"/>
-              <w:rPr>
-                <w:rFonts w:ascii="Arial" w:hAnsi="Arial" w:cs="Arial"/>
-              </w:rPr>
             </w:pPr>
             <w:r>
               <w:rPr>
-                <w:rFonts w:cs="Arial" w:ascii="Arial" w:hAnsi="Arial"/>
-              </w:rPr>
-              <mc:AlternateContent>
-                <mc:Choice Requires="wps">
-                  <w:drawing>
-                    <wp:anchor behindDoc="0" distT="12700" distB="12700" distL="12700" distR="12700" simplePos="0" locked="0" layoutInCell="1" allowOverlap="1" relativeHeight="5" wp14:anchorId="3DDCFDBA">
-                      <wp:simplePos x="0" y="0"/>
-                      <wp:positionH relativeFrom="column">
-                        <wp:posOffset>349250</wp:posOffset>
-                      </wp:positionH>
-                      <wp:positionV relativeFrom="paragraph">
-                        <wp:posOffset>146050</wp:posOffset>
-                      </wp:positionV>
-                      <wp:extent cx="144780" cy="134620"/>
-                      <wp:effectExtent l="12700" t="12700" r="12700" b="12700"/>
-                      <wp:wrapNone/>
-                      <wp:docPr id="1" name="Retângulo 1"/>
-                      <a:graphic xmlns:a="http://schemas.openxmlformats.org/drawingml/2006/main">
-                        <a:graphicData uri="http://schemas.microsoft.com/office/word/2010/wordprocessingShape">
-                          <wps:wsp>
-                            <wps:cNvSpPr/>
-                            <wps:spPr>
-                              <a:xfrm>
-                                <a:off x="0" y="0"/>
-                                <a:ext cx="144720" cy="134640"/>
-                              </a:xfrm>
-                              <a:prstGeom prst="rect">
-                                <a:avLst/>
-                              </a:prstGeom>
-                              <a:solidFill>
-                                <a:schemeClr val="bg1"/>
-                              </a:solidFill>
-                              <a:ln>
-                                <a:solidFill>
-                                  <a:srgbClr val="000000"/>
-                                </a:solidFill>
-                                <a:round/>
-                              </a:ln>
-                            </wps:spPr>
-                            <wps:style>
-                              <a:lnRef idx="2">
-                                <a:schemeClr val="dk1">
-                                  <a:shade val="15000"/>
-                                </a:schemeClr>
-                              </a:lnRef>
-                              <a:fillRef idx="1">
-                                <a:schemeClr val="dk1"/>
-                              </a:fillRef>
-                              <a:effectRef idx="0">
-                                <a:schemeClr val="dk1"/>
-                              </a:effectRef>
-                              <a:fontRef idx="minor"/>
-                            </wps:style>
-                            <wps:bodyPr/>
-                          </wps:wsp>
-                        </a:graphicData>
-                      </a:graphic>
-                    </wp:anchor>
-                  </w:drawing>
-                </mc:Choice>
-                <mc:Fallback>
-                  <w:pict>
-                    <v:rect id="shape_0" ID="Retângulo 1" path="m0,0l-2147483645,0l-2147483645,-2147483646l0,-2147483646xe" fillcolor="white" stroked="t" o:allowincell="f" style="position:absolute;margin-left:27.5pt;margin-top:11.5pt;width:11.35pt;height:10.55pt;mso-wrap-style:none;v-text-anchor:middle" wp14:anchorId="3DDCFDBA">
-                      <v:fill o:detectmouseclick="t" type="solid" color2="black"/>
-                      <v:stroke color="black" weight="25560" joinstyle="round" endcap="flat"/>
-                      <w10:wrap type="none"/>
-                    </v:rect>
-                  </w:pict>
-                </mc:Fallback>
-              </mc:AlternateContent>
-              <mc:AlternateContent>
-                <mc:Choice Requires="wps">
-                  <w:drawing>
-                    <wp:anchor behindDoc="0" distT="12700" distB="12700" distL="12700" distR="12700" simplePos="0" locked="0" layoutInCell="1" allowOverlap="1" relativeHeight="6" wp14:anchorId="212F0106">
-                      <wp:simplePos x="0" y="0"/>
-                      <wp:positionH relativeFrom="column">
-                        <wp:posOffset>1136015</wp:posOffset>
-                      </wp:positionH>
-                      <wp:positionV relativeFrom="paragraph">
-                        <wp:posOffset>147320</wp:posOffset>
-                      </wp:positionV>
-                      <wp:extent cx="144780" cy="134620"/>
-                      <wp:effectExtent l="12700" t="12700" r="12700" b="12700"/>
-                      <wp:wrapNone/>
-                      <wp:docPr id="2" name="Retângulo 1"/>
-                      <a:graphic xmlns:a="http://schemas.openxmlformats.org/drawingml/2006/main">
-                        <a:graphicData uri="http://schemas.microsoft.com/office/word/2010/wordprocessingShape">
-                          <wps:wsp>
-                            <wps:cNvSpPr/>
-                            <wps:spPr>
-                              <a:xfrm>
-                                <a:off x="0" y="0"/>
-                                <a:ext cx="144720" cy="134640"/>
-                              </a:xfrm>
-                              <a:prstGeom prst="rect">
-                                <a:avLst/>
-                              </a:prstGeom>
-                              <a:solidFill>
-                                <a:schemeClr val="bg1"/>
-                              </a:solidFill>
-                              <a:ln>
-                                <a:solidFill>
-                                  <a:srgbClr val="4f81bd"/>
-                                </a:solidFill>
-                                <a:round/>
-                              </a:ln>
-                            </wps:spPr>
-                            <wps:style>
-                              <a:lnRef idx="2">
-                                <a:schemeClr val="accent1"/>
-                              </a:lnRef>
-                              <a:fillRef idx="1">
-                                <a:schemeClr val="lt1"/>
-                              </a:fillRef>
-                              <a:effectRef idx="0">
-                                <a:schemeClr val="accent1"/>
-                              </a:effectRef>
-                              <a:fontRef idx="minor"/>
-                            </wps:style>
-                            <wps:bodyPr/>
-                          </wps:wsp>
-                        </a:graphicData>
-                      </a:graphic>
-                    </wp:anchor>
-                  </w:drawing>
-                </mc:Choice>
-                <mc:Fallback>
-                  <w:pict>
-                    <v:rect id="shape_0" ID="Retângulo 1" path="m0,0l-2147483645,0l-2147483645,-2147483646l0,-2147483646xe" fillcolor="white" stroked="t" o:allowincell="f" style="position:absolute;margin-left:89.45pt;margin-top:11.6pt;width:11.35pt;height:10.55pt;mso-wrap-style:none;v-text-anchor:middle" wp14:anchorId="212F0106">
-                      <v:fill o:detectmouseclick="t" type="solid" color2="black"/>
-                      <v:stroke color="#4f81bd" weight="25560" joinstyle="round" endcap="flat"/>
-                      <w10:wrap type="none"/>
-                    </v:rect>
-                  </w:pict>
-                </mc:Fallback>
-              </mc:AlternateContent>
-            </w:r>
-          </w:p>
-          <w:p>
-            <w:pPr>
-              <w:pStyle w:val="Normal"/>
-              <w:widowControl/>
-              <w:suppressAutoHyphens w:val="true"/>
-              <w:spacing w:before="0" w:after="0"/>
-              <w:jc w:val="start"/>
-              <w:rPr>
-                <w:rFonts w:ascii="Arial" w:hAnsi="Arial" w:cs="Arial"/>
-              </w:rPr>
-            </w:pPr>
-            <w:r>
-              <w:rPr>
-                <w:rFonts w:eastAsia="Times New Roman" w:cs="Arial" w:ascii="Arial" w:hAnsi="Arial"/>
-                <w:kern w:val="0"/>
+                <w:rFonts w:ascii="Arial" w:hAnsi="Arial" w:eastAsia="Arial" w:cs="Arial"/>
                 <w:sz w:val="20"/>
-                <w:szCs w:val="20"/>
-                <w:lang w:val="pt-BR" w:eastAsia="pt-BR" w:bidi="ar-SA"/>
-              </w:rPr>
-              <w:t xml:space="preserve">               </w:t>
-            </w:r>
-            <w:r>
-              <w:rPr>
-                <w:rFonts w:eastAsia="Times New Roman" w:cs="Arial" w:ascii="Arial" w:hAnsi="Arial"/>
-                <w:kern w:val="0"/>
-                <w:sz w:val="20"/>
-                <w:szCs w:val="20"/>
-                <w:lang w:val="pt-BR" w:eastAsia="pt-BR" w:bidi="ar-SA"/>
-              </w:rPr>
-              <w:t>SIM                NÃO</w:t>
+              </w:rPr>
+              <w:t>□ SIM      ■ NÃO</w:t>
             </w:r>
           </w:p>
         </w:tc>
@@ -286,200 +123,40 @@
             <w:tcW w:w="2731" w:type="dxa"/>
             <w:gridSpan w:val="5"/>
             <w:tcBorders/>
+            <w:tcMar>
+              <w:top w:w="40" w:type="dxa"/>
+              <w:start w:w="50" w:type="dxa"/>
+              <w:bottom w:w="40" w:type="dxa"/>
+              <w:end w:w="50" w:type="dxa"/>
+            </w:tcMar>
+            <w:vAlign w:val="center"/>
           </w:tcPr>
           <w:p>
             <w:pPr>
-              <w:pStyle w:val="Normal"/>
-              <w:widowControl/>
-              <w:suppressAutoHyphens w:val="true"/>
-              <w:spacing w:before="0" w:after="0"/>
+              <w:keepNext w:val="0"/>
+              <w:spacing w:before="0" w:after="0" w:line="240" w:lineRule="auto"/>
               <w:jc w:val="center"/>
-              <w:rPr>
-                <w:rFonts w:ascii="Arial" w:hAnsi="Arial" w:cs="Arial"/>
-              </w:rPr>
             </w:pPr>
             <w:r>
               <w:rPr>
-                <w:rFonts w:eastAsia="Times New Roman" w:cs="Arial" w:ascii="Arial" w:hAnsi="Arial"/>
-                <w:kern w:val="0"/>
-                <w:sz w:val="20"/>
-                <w:szCs w:val="20"/>
-                <w:lang w:val="pt-BR" w:eastAsia="pt-BR" w:bidi="ar-SA"/>
+                <w:rFonts w:ascii="Arial" w:hAnsi="Arial" w:eastAsia="Arial" w:cs="Arial"/>
+                <w:sz w:val="18"/>
               </w:rPr>
               <w:t>Quadra geral c/gaveta:</w:t>
             </w:r>
           </w:p>
           <w:p>
             <w:pPr>
-              <w:pStyle w:val="Normal"/>
-              <w:widowControl/>
-              <w:suppressAutoHyphens w:val="true"/>
-              <w:spacing w:before="0" w:after="0"/>
+              <w:keepNext w:val="0"/>
+              <w:spacing w:before="0" w:after="0" w:line="240" w:lineRule="auto"/>
               <w:jc w:val="center"/>
-              <w:rPr>
-                <w:rFonts w:ascii="Arial" w:hAnsi="Arial" w:cs="Arial"/>
-              </w:rPr>
             </w:pPr>
             <w:r>
               <w:rPr>
-                <w:rFonts w:cs="Arial" w:ascii="Arial" w:hAnsi="Arial"/>
-              </w:rPr>
-              <mc:AlternateContent>
-                <mc:Choice Requires="wps">
-                  <w:drawing>
-                    <wp:anchor behindDoc="0" distT="12700" distB="12700" distL="12700" distR="12700" simplePos="0" locked="0" layoutInCell="1" allowOverlap="1" relativeHeight="7" wp14:anchorId="438CA189">
-                      <wp:simplePos x="0" y="0"/>
-                      <wp:positionH relativeFrom="column">
-                        <wp:posOffset>149860</wp:posOffset>
-                      </wp:positionH>
-                      <wp:positionV relativeFrom="paragraph">
-                        <wp:posOffset>144780</wp:posOffset>
-                      </wp:positionV>
-                      <wp:extent cx="144780" cy="134620"/>
-                      <wp:effectExtent l="12700" t="12700" r="12700" b="12700"/>
-                      <wp:wrapNone/>
-                      <wp:docPr id="3" name="Retângulo 1"/>
-                      <a:graphic xmlns:a="http://schemas.openxmlformats.org/drawingml/2006/main">
-                        <a:graphicData uri="http://schemas.microsoft.com/office/word/2010/wordprocessingShape">
-                          <wps:wsp>
-                            <wps:cNvSpPr/>
-                            <wps:spPr>
-                              <a:xfrm>
-                                <a:off x="0" y="0"/>
-                                <a:ext cx="144720" cy="134640"/>
-                              </a:xfrm>
-                              <a:prstGeom prst="rect">
-                                <a:avLst/>
-                              </a:prstGeom>
-                              <a:solidFill>
-                                <a:schemeClr val="bg1"/>
-                              </a:solidFill>
-                              <a:ln>
-                                <a:solidFill>
-                                  <a:srgbClr val="000000"/>
-                                </a:solidFill>
-                                <a:round/>
-                              </a:ln>
-                            </wps:spPr>
-                            <wps:style>
-                              <a:lnRef idx="2">
-                                <a:schemeClr val="dk1"/>
-                              </a:lnRef>
-                              <a:fillRef idx="1">
-                                <a:schemeClr val="lt1"/>
-                              </a:fillRef>
-                              <a:effectRef idx="0">
-                                <a:schemeClr val="dk1"/>
-                              </a:effectRef>
-                              <a:fontRef idx="minor"/>
-                            </wps:style>
-                            <wps:bodyPr/>
-                          </wps:wsp>
-                        </a:graphicData>
-                      </a:graphic>
-                    </wp:anchor>
-                  </w:drawing>
-                </mc:Choice>
-                <mc:Fallback>
-                  <w:pict>
-                    <v:rect id="shape_0" ID="Retângulo 1" path="m0,0l-2147483645,0l-2147483645,-2147483646l0,-2147483646xe" fillcolor="white" stroked="t" o:allowincell="f" style="position:absolute;margin-left:11.8pt;margin-top:11.4pt;width:11.35pt;height:10.55pt;mso-wrap-style:none;v-text-anchor:middle" wp14:anchorId="438CA189">
-                      <v:fill o:detectmouseclick="t" type="solid" color2="black"/>
-                      <v:stroke color="black" weight="25560" joinstyle="round" endcap="flat"/>
-                      <w10:wrap type="none"/>
-                    </v:rect>
-                  </w:pict>
-                </mc:Fallback>
-              </mc:AlternateContent>
-              <mc:AlternateContent>
-                <mc:Choice Requires="wps">
-                  <w:drawing>
-                    <wp:anchor behindDoc="0" distT="12700" distB="12700" distL="12700" distR="12700" simplePos="0" locked="0" layoutInCell="1" allowOverlap="1" relativeHeight="8" wp14:anchorId="64E1641F">
-                      <wp:simplePos x="0" y="0"/>
-                      <wp:positionH relativeFrom="column">
-                        <wp:posOffset>781050</wp:posOffset>
-                      </wp:positionH>
-                      <wp:positionV relativeFrom="paragraph">
-                        <wp:posOffset>153035</wp:posOffset>
-                      </wp:positionV>
-                      <wp:extent cx="144780" cy="134620"/>
-                      <wp:effectExtent l="12700" t="12700" r="12700" b="12700"/>
-                      <wp:wrapNone/>
-                      <wp:docPr id="4" name="Retângulo 1"/>
-                      <a:graphic xmlns:a="http://schemas.openxmlformats.org/drawingml/2006/main">
-                        <a:graphicData uri="http://schemas.microsoft.com/office/word/2010/wordprocessingShape">
-                          <wps:wsp>
-                            <wps:cNvSpPr/>
-                            <wps:spPr>
-                              <a:xfrm>
-                                <a:off x="0" y="0"/>
-                                <a:ext cx="144720" cy="134640"/>
-                              </a:xfrm>
-                              <a:prstGeom prst="rect">
-                                <a:avLst/>
-                              </a:prstGeom>
-                              <a:solidFill>
-                                <a:schemeClr val="bg1"/>
-                              </a:solidFill>
-                              <a:ln>
-                                <a:solidFill>
-                                  <a:srgbClr val="000000"/>
-                                </a:solidFill>
-                                <a:round/>
-                              </a:ln>
-                            </wps:spPr>
-                            <wps:style>
-                              <a:lnRef idx="2">
-                                <a:schemeClr val="dk1">
-                                  <a:shade val="15000"/>
-                                </a:schemeClr>
-                              </a:lnRef>
-                              <a:fillRef idx="1">
-                                <a:schemeClr val="dk1"/>
-                              </a:fillRef>
-                              <a:effectRef idx="0">
-                                <a:schemeClr val="dk1"/>
-                              </a:effectRef>
-                              <a:fontRef idx="minor"/>
-                            </wps:style>
-                            <wps:bodyPr/>
-                          </wps:wsp>
-                        </a:graphicData>
-                      </a:graphic>
-                    </wp:anchor>
-                  </w:drawing>
-                </mc:Choice>
-                <mc:Fallback>
-                  <w:pict>
-                    <v:rect id="shape_0" ID="Retângulo 1" path="m0,0l-2147483645,0l-2147483645,-2147483646l0,-2147483646xe" fillcolor="white" stroked="t" o:allowincell="f" style="position:absolute;margin-left:61.5pt;margin-top:12.05pt;width:11.35pt;height:10.55pt;mso-wrap-style:none;v-text-anchor:middle" wp14:anchorId="64E1641F">
-                      <v:fill o:detectmouseclick="t" type="solid" color2="black"/>
-                      <v:stroke color="black" weight="25560" joinstyle="round" endcap="flat"/>
-                      <w10:wrap type="none"/>
-                    </v:rect>
-                  </w:pict>
-                </mc:Fallback>
-              </mc:AlternateContent>
-            </w:r>
-          </w:p>
-          <w:p>
-            <w:pPr>
-              <w:pStyle w:val="Normal"/>
-              <w:widowControl/>
-              <w:suppressAutoHyphens w:val="true"/>
-              <w:spacing w:before="0" w:after="0"/>
-              <w:jc w:val="center"/>
-              <w:rPr>
-                <w:rFonts w:ascii="Arial" w:hAnsi="Arial" w:cs="Arial"/>
-              </w:rPr>
-            </w:pPr>
-            <w:r>
-              <w:rPr>
-                <w:rFonts w:eastAsia="Times New Roman" w:cs="Arial" w:ascii="Arial" w:hAnsi="Arial"/>
-                <w:kern w:val="0"/>
+                <w:rFonts w:ascii="Arial" w:hAnsi="Arial" w:eastAsia="Arial" w:cs="Arial"/>
                 <w:sz w:val="20"/>
-                <w:szCs w:val="20"/>
-                <w:lang w:val="pt-BR" w:eastAsia="pt-BR" w:bidi="ar-SA"/>
-              </w:rPr>
-              <w:t>SIM            NÃO</w:t>
+              </w:rPr>
+              <w:t>■ SIM      □ NÃO</w:t>
             </w:r>
           </w:p>
         </w:tc>
@@ -487,286 +164,88 @@
           <w:tcPr>
             <w:tcW w:w="3264" w:type="dxa"/>
             <w:tcBorders/>
+            <w:tcMar>
+              <w:top w:w="40" w:type="dxa"/>
+              <w:start w:w="50" w:type="dxa"/>
+              <w:bottom w:w="40" w:type="dxa"/>
+              <w:end w:w="50" w:type="dxa"/>
+            </w:tcMar>
+            <w:vAlign w:val="center"/>
           </w:tcPr>
           <w:p>
             <w:pPr>
-              <w:pStyle w:val="Normal"/>
-              <w:widowControl/>
-              <w:suppressAutoHyphens w:val="true"/>
-              <w:spacing w:before="0" w:after="0"/>
+              <w:keepNext w:val="0"/>
+              <w:spacing w:before="0" w:after="0" w:line="240" w:lineRule="auto"/>
               <w:jc w:val="center"/>
-              <w:rPr>
-                <w:rFonts w:ascii="Arial" w:hAnsi="Arial" w:cs="Arial"/>
-              </w:rPr>
             </w:pPr>
             <w:r>
               <w:rPr>
-                <w:rFonts w:eastAsia="Times New Roman" w:cs="Arial" w:ascii="Arial" w:hAnsi="Arial"/>
-                <w:kern w:val="0"/>
-                <w:sz w:val="20"/>
-                <w:szCs w:val="20"/>
-                <w:lang w:val="pt-BR" w:eastAsia="pt-BR" w:bidi="ar-SA"/>
+                <w:rFonts w:ascii="Arial" w:hAnsi="Arial" w:eastAsia="Arial" w:cs="Arial"/>
+                <w:sz w:val="18"/>
               </w:rPr>
               <w:t>Columbário:</w:t>
             </w:r>
           </w:p>
           <w:p>
             <w:pPr>
-              <w:pStyle w:val="Normal"/>
-              <w:widowControl/>
-              <w:suppressAutoHyphens w:val="true"/>
-              <w:spacing w:before="0" w:after="0"/>
+              <w:keepNext w:val="0"/>
+              <w:spacing w:before="0" w:after="0" w:line="240" w:lineRule="auto"/>
               <w:jc w:val="center"/>
-              <w:rPr>
-                <w:rFonts w:ascii="Arial" w:hAnsi="Arial" w:cs="Arial"/>
-              </w:rPr>
             </w:pPr>
             <w:r>
               <w:rPr>
-                <w:rFonts w:cs="Arial" w:ascii="Arial" w:hAnsi="Arial"/>
-              </w:rPr>
-              <mc:AlternateContent>
-                <mc:Choice Requires="wps">
-                  <w:drawing>
-                    <wp:anchor behindDoc="0" distT="12700" distB="12700" distL="12700" distR="12700" simplePos="0" locked="0" layoutInCell="1" allowOverlap="1" relativeHeight="9" wp14:anchorId="38F5878D">
-                      <wp:simplePos x="0" y="0"/>
-                      <wp:positionH relativeFrom="column">
-                        <wp:posOffset>937895</wp:posOffset>
-                      </wp:positionH>
-                      <wp:positionV relativeFrom="paragraph">
-                        <wp:posOffset>140335</wp:posOffset>
-                      </wp:positionV>
-                      <wp:extent cx="144780" cy="134620"/>
-                      <wp:effectExtent l="12700" t="12700" r="12700" b="12700"/>
-                      <wp:wrapNone/>
-                      <wp:docPr id="5" name="Retângulo 1"/>
-                      <a:graphic xmlns:a="http://schemas.openxmlformats.org/drawingml/2006/main">
-                        <a:graphicData uri="http://schemas.microsoft.com/office/word/2010/wordprocessingShape">
-                          <wps:wsp>
-                            <wps:cNvSpPr/>
-                            <wps:spPr>
-                              <a:xfrm>
-                                <a:off x="0" y="0"/>
-                                <a:ext cx="144720" cy="134640"/>
-                              </a:xfrm>
-                              <a:prstGeom prst="rect">
-                                <a:avLst/>
-                              </a:prstGeom>
-                              <a:solidFill>
-                                <a:schemeClr val="bg1"/>
-                              </a:solidFill>
-                              <a:ln>
-                                <a:solidFill>
-                                  <a:srgbClr val="000000"/>
-                                </a:solidFill>
-                                <a:round/>
-                              </a:ln>
-                            </wps:spPr>
-                            <wps:style>
-                              <a:lnRef idx="2">
-                                <a:schemeClr val="dk1">
-                                  <a:shade val="15000"/>
-                                </a:schemeClr>
-                              </a:lnRef>
-                              <a:fillRef idx="1">
-                                <a:schemeClr val="dk1"/>
-                              </a:fillRef>
-                              <a:effectRef idx="0">
-                                <a:schemeClr val="dk1"/>
-                              </a:effectRef>
-                              <a:fontRef idx="minor"/>
-                            </wps:style>
-                            <wps:bodyPr/>
-                          </wps:wsp>
-                        </a:graphicData>
-                      </a:graphic>
-                    </wp:anchor>
-                  </w:drawing>
-                </mc:Choice>
-                <mc:Fallback>
-                  <w:pict>
-                    <v:rect id="shape_0" ID="Retângulo 1" path="m0,0l-2147483645,0l-2147483645,-2147483646l0,-2147483646xe" fillcolor="white" stroked="t" o:allowincell="f" style="position:absolute;margin-left:73.85pt;margin-top:11.05pt;width:11.35pt;height:10.55pt;mso-wrap-style:none;v-text-anchor:middle" wp14:anchorId="38F5878D">
-                      <v:fill o:detectmouseclick="t" type="solid" color2="black"/>
-                      <v:stroke color="black" weight="25560" joinstyle="round" endcap="flat"/>
-                      <w10:wrap type="none"/>
-                    </v:rect>
-                  </w:pict>
-                </mc:Fallback>
-              </mc:AlternateContent>
-              <mc:AlternateContent>
-                <mc:Choice Requires="wps">
-                  <w:drawing>
-                    <wp:anchor behindDoc="0" distT="12700" distB="12700" distL="12700" distR="12700" simplePos="0" locked="0" layoutInCell="1" allowOverlap="1" relativeHeight="10" wp14:anchorId="2D8690AC">
-                      <wp:simplePos x="0" y="0"/>
-                      <wp:positionH relativeFrom="column">
-                        <wp:posOffset>356235</wp:posOffset>
-                      </wp:positionH>
-                      <wp:positionV relativeFrom="paragraph">
-                        <wp:posOffset>142875</wp:posOffset>
-                      </wp:positionV>
-                      <wp:extent cx="144780" cy="134620"/>
-                      <wp:effectExtent l="12700" t="12700" r="12700" b="12700"/>
-                      <wp:wrapNone/>
-                      <wp:docPr id="6" name="Retângulo 1"/>
-                      <a:graphic xmlns:a="http://schemas.openxmlformats.org/drawingml/2006/main">
-                        <a:graphicData uri="http://schemas.microsoft.com/office/word/2010/wordprocessingShape">
-                          <wps:wsp>
-                            <wps:cNvSpPr/>
-                            <wps:spPr>
-                              <a:xfrm>
-                                <a:off x="0" y="0"/>
-                                <a:ext cx="144720" cy="134640"/>
-                              </a:xfrm>
-                              <a:prstGeom prst="rect">
-                                <a:avLst/>
-                              </a:prstGeom>
-                              <a:solidFill>
-                                <a:srgbClr val="ffffff"/>
-                              </a:solidFill>
-                              <a:ln>
-                                <a:solidFill>
-                                  <a:srgbClr val="4f81bd"/>
-                                </a:solidFill>
-                                <a:round/>
-                              </a:ln>
-                            </wps:spPr>
-                            <wps:style>
-                              <a:lnRef idx="2">
-                                <a:schemeClr val="accent1"/>
-                              </a:lnRef>
-                              <a:fillRef idx="1">
-                                <a:schemeClr val="lt1"/>
-                              </a:fillRef>
-                              <a:effectRef idx="0">
-                                <a:schemeClr val="accent1"/>
-                              </a:effectRef>
-                              <a:fontRef idx="minor"/>
-                            </wps:style>
-                            <wps:bodyPr/>
-                          </wps:wsp>
-                        </a:graphicData>
-                      </a:graphic>
-                    </wp:anchor>
-                  </w:drawing>
-                </mc:Choice>
-                <mc:Fallback>
-                  <w:pict>
-                    <v:rect id="shape_0" ID="Retângulo 1" path="m0,0l-2147483645,0l-2147483645,-2147483646l0,-2147483646xe" fillcolor="white" stroked="t" o:allowincell="f" style="position:absolute;margin-left:28.05pt;margin-top:11.25pt;width:11.35pt;height:10.55pt;mso-wrap-style:none;v-text-anchor:middle" wp14:anchorId="2D8690AC">
-                      <v:fill o:detectmouseclick="t" type="solid" color2="black"/>
-                      <v:stroke color="#4f81bd" weight="25560" joinstyle="round" endcap="flat"/>
-                      <w10:wrap type="none"/>
-                    </v:rect>
-                  </w:pict>
-                </mc:Fallback>
-              </mc:AlternateContent>
-            </w:r>
-          </w:p>
-          <w:p>
-            <w:pPr>
-              <w:pStyle w:val="Normal"/>
-              <w:widowControl/>
-              <w:suppressAutoHyphens w:val="true"/>
-              <w:spacing w:before="0" w:after="0"/>
-              <w:jc w:val="center"/>
-              <w:rPr>
-                <w:rFonts w:ascii="Arial" w:hAnsi="Arial" w:cs="Arial"/>
-              </w:rPr>
-            </w:pPr>
-            <w:r>
-              <w:rPr>
-                <w:rFonts w:eastAsia="Times New Roman" w:cs="Arial" w:ascii="Arial" w:hAnsi="Arial"/>
-                <w:kern w:val="0"/>
+                <w:rFonts w:ascii="Arial" w:hAnsi="Arial" w:eastAsia="Arial" w:cs="Arial"/>
                 <w:sz w:val="20"/>
-                <w:szCs w:val="20"/>
-                <w:lang w:val="pt-BR" w:eastAsia="pt-BR" w:bidi="ar-SA"/>
-              </w:rPr>
-              <w:t xml:space="preserve">    </w:t>
-            </w:r>
-            <w:r>
-              <w:rPr>
-                <w:rFonts w:eastAsia="Times New Roman" w:cs="Arial" w:ascii="Arial" w:hAnsi="Arial"/>
-                <w:kern w:val="0"/>
-                <w:sz w:val="20"/>
-                <w:szCs w:val="20"/>
-                <w:lang w:val="pt-BR" w:eastAsia="pt-BR" w:bidi="ar-SA"/>
-              </w:rPr>
-              <w:t>SIM            NÃO</w:t>
+              </w:rPr>
+              <w:t>□ SIM      □ NÃO</w:t>
             </w:r>
           </w:p>
         </w:tc>
       </w:tr>
       <w:tr>
         <w:trPr>
-          <w:trHeight w:val="544" w:hRule="atLeast"/>
+          <w:trHeight w:val="425" w:hRule="atLeast"/>
         </w:trPr>
         <w:tc>
           <w:tcPr>
             <w:tcW w:w="4297" w:type="dxa"/>
             <w:gridSpan w:val="3"/>
             <w:tcBorders/>
+            <w:tcMar>
+              <w:top w:w="40" w:type="dxa"/>
+              <w:start w:w="50" w:type="dxa"/>
+              <w:bottom w:w="40" w:type="dxa"/>
+              <w:end w:w="50" w:type="dxa"/>
+            </w:tcMar>
+            <w:vAlign w:val="center"/>
           </w:tcPr>
           <w:p>
             <w:pPr>
-              <w:pStyle w:val="Normal"/>
-              <w:widowControl/>
-              <w:suppressAutoHyphens w:val="true"/>
-              <w:spacing w:before="0" w:after="0"/>
-              <w:jc w:val="start"/>
-              <w:rPr>
-                <w:rFonts w:ascii="Arial" w:hAnsi="Arial" w:cs="Arial"/>
-                <w:sz w:val="18"/>
-                <w:szCs w:val="18"/>
-              </w:rPr>
+              <w:keepNext w:val="0"/>
+              <w:spacing w:before="0" w:after="0" w:line="240" w:lineRule="auto"/>
+              <w:jc w:val="center"/>
             </w:pPr>
             <w:r>
               <w:rPr>
-                <w:rFonts w:eastAsia="Times New Roman" w:cs="Arial" w:ascii="Arial" w:hAnsi="Arial"/>
-                <w:kern w:val="0"/>
-                <w:sz w:val="18"/>
-                <w:szCs w:val="18"/>
-                <w:lang w:val="pt-BR" w:eastAsia="pt-BR" w:bidi="ar-SA"/>
+                <w:rFonts w:ascii="Arial" w:hAnsi="Arial" w:eastAsia="Arial" w:cs="Arial"/>
+                <w:sz w:val="17"/>
               </w:rPr>
               <w:t>N° de Inscrição (GSCEMI):</w:t>
             </w:r>
           </w:p>
           <w:p>
             <w:pPr>
-              <w:pStyle w:val="Normal"/>
-              <w:widowControl/>
-              <w:suppressAutoHyphens w:val="true"/>
-              <w:spacing w:before="0" w:after="0"/>
-              <w:jc w:val="both"/>
-              <w:rPr>
-                <w:rFonts w:ascii="Arial" w:hAnsi="Arial" w:cs="Arial"/>
+              <w:keepNext w:val="0"/>
+              <w:spacing w:before="0" w:after="0" w:line="240" w:lineRule="auto"/>
+              <w:jc w:val="center"/>
+            </w:pPr>
+            <w:r>
+              <w:rPr>
+                <w:rFonts w:ascii="Arial" w:hAnsi="Arial" w:eastAsia="Arial" w:cs="Arial"/>
                 <w:b/>
-                <w:bCs/>
-                <w:sz w:val="22"/>
-                <w:szCs w:val="22"/>
-              </w:rPr>
-            </w:pPr>
-            <w:r>
-              <w:rPr>
-                <w:rFonts w:eastAsia="Times New Roman" w:cs="Arial" w:ascii="Arial" w:hAnsi="Arial"/>
-                <w:b/>
-                <w:bCs/>
-                <w:kern w:val="0"/>
-                <w:sz w:val="15"/>
-                <w:szCs w:val="22"/>
-                <w:lang w:val="pt-BR" w:eastAsia="pt-BR" w:bidi="ar-SA"/>
-              </w:rPr>
-              <w:t xml:space="preserve">          </w:t>
-            </w:r>
-            <w:r>
-              <w:rPr>
-                <w:rFonts w:eastAsia="Times New Roman" w:cs="Arial" w:ascii="Arial" w:hAnsi="Arial"/>
-                <w:b/>
-                <w:bCs/>
-                <w:kern w:val="0"/>
-                <w:sz w:val="15"/>
-                <w:szCs w:val="22"/>
-                <w:lang w:val="pt-BR" w:eastAsia="pt-BR" w:bidi="ar-SA"/>
-              </w:rPr>
-              <w:t>{{inscrGS}}</w:t>
+                <w:sz w:val="20"/>
+              </w:rPr>
+              <w:t>{inscrGS}</w:t>
             </w:r>
           </w:p>
         </w:tc>
@@ -775,40 +254,41 @@
             <w:tcW w:w="2143" w:type="dxa"/>
             <w:gridSpan w:val="3"/>
             <w:tcBorders/>
+            <w:tcMar>
+              <w:top w:w="40" w:type="dxa"/>
+              <w:start w:w="50" w:type="dxa"/>
+              <w:bottom w:w="40" w:type="dxa"/>
+              <w:end w:w="50" w:type="dxa"/>
+            </w:tcMar>
+            <w:vAlign w:val="center"/>
           </w:tcPr>
           <w:p>
             <w:pPr>
-              <w:pStyle w:val="Normal"/>
-              <w:widowControl/>
-              <w:suppressAutoHyphens w:val="true"/>
-              <w:spacing w:before="0" w:after="0"/>
+              <w:keepNext w:val="0"/>
+              <w:spacing w:before="0" w:after="0" w:line="240" w:lineRule="auto"/>
               <w:jc w:val="center"/>
-              <w:rPr>
-                <w:rFonts w:ascii="Arial" w:hAnsi="Arial" w:cs="Arial"/>
-                <w:sz w:val="18"/>
-                <w:szCs w:val="18"/>
-              </w:rPr>
             </w:pPr>
             <w:r>
               <w:rPr>
-                <w:rFonts w:eastAsia="Times New Roman" w:cs="Arial" w:ascii="Arial" w:hAnsi="Arial"/>
-                <w:kern w:val="0"/>
-                <w:sz w:val="18"/>
-                <w:szCs w:val="18"/>
-                <w:lang w:val="pt-BR" w:eastAsia="pt-BR" w:bidi="ar-SA"/>
+                <w:rFonts w:ascii="Arial" w:hAnsi="Arial" w:eastAsia="Arial" w:cs="Arial"/>
+                <w:sz w:val="17"/>
               </w:rPr>
               <w:t>Nº da DO:</w:t>
-              <w:br/>
-            </w:r>
-            <w:r>
-              <w:rPr>
-                <w:rFonts w:eastAsia="Times New Roman" w:cs="Times New Roman"/>
-                <w:kern w:val="0"/>
+            </w:r>
+          </w:p>
+          <w:p>
+            <w:pPr>
+              <w:keepNext w:val="0"/>
+              <w:spacing w:before="0" w:after="0" w:line="240" w:lineRule="auto"/>
+              <w:jc w:val="center"/>
+            </w:pPr>
+            <w:r>
+              <w:rPr>
+                <w:rFonts w:ascii="Arial" w:hAnsi="Arial" w:eastAsia="Arial" w:cs="Arial"/>
+                <w:b/>
                 <w:sz w:val="20"/>
-                <w:szCs w:val="20"/>
-                <w:lang w:val="pt-BR" w:eastAsia="pt-BR" w:bidi="ar-SA"/>
-              </w:rPr>
-              <w:t xml:space="preserve"> {{numDO}}</w:t>
+              </w:rPr>
+              <w:t>{numDO}</w:t>
             </w:r>
           </w:p>
         </w:tc>
@@ -817,232 +297,138 @@
             <w:tcW w:w="3619" w:type="dxa"/>
             <w:gridSpan w:val="2"/>
             <w:tcBorders/>
+            <w:tcMar>
+              <w:top w:w="40" w:type="dxa"/>
+              <w:start w:w="50" w:type="dxa"/>
+              <w:bottom w:w="40" w:type="dxa"/>
+              <w:end w:w="50" w:type="dxa"/>
+            </w:tcMar>
+            <w:vAlign w:val="center"/>
           </w:tcPr>
           <w:p>
             <w:pPr>
-              <w:pStyle w:val="Normal"/>
-              <w:widowControl/>
-              <w:suppressAutoHyphens w:val="true"/>
-              <w:spacing w:before="0" w:after="0"/>
+              <w:keepNext w:val="0"/>
+              <w:spacing w:before="0" w:after="0" w:line="240" w:lineRule="auto"/>
               <w:jc w:val="center"/>
-              <w:rPr>
-                <w:rFonts w:ascii="Arial" w:hAnsi="Arial" w:cs="Arial"/>
-                <w:sz w:val="18"/>
-                <w:szCs w:val="18"/>
-              </w:rPr>
             </w:pPr>
             <w:r>
               <w:rPr>
-                <w:rFonts w:eastAsia="Times New Roman" w:cs="Arial" w:ascii="Arial" w:hAnsi="Arial"/>
-                <w:kern w:val="0"/>
-                <w:sz w:val="18"/>
-                <w:szCs w:val="18"/>
-                <w:lang w:val="pt-BR" w:eastAsia="pt-BR" w:bidi="ar-SA"/>
+                <w:rFonts w:ascii="Arial" w:hAnsi="Arial" w:eastAsia="Arial" w:cs="Arial"/>
+                <w:sz w:val="17"/>
               </w:rPr>
               <w:t>Nº Placa de Identificação:</w:t>
             </w:r>
           </w:p>
           <w:p>
             <w:pPr>
-              <w:pStyle w:val="Normal"/>
-              <w:widowControl/>
-              <w:suppressAutoHyphens w:val="true"/>
-              <w:spacing w:before="0" w:after="0"/>
-              <w:jc w:val="start"/>
-              <w:rPr>
-                <w:rFonts w:ascii="Arial" w:hAnsi="Arial" w:cs="Arial"/>
+              <w:keepNext w:val="0"/>
+              <w:spacing w:before="0" w:after="0" w:line="240" w:lineRule="auto"/>
+              <w:jc w:val="center"/>
+            </w:pPr>
+            <w:r>
+              <w:rPr>
+                <w:rFonts w:ascii="Arial" w:hAnsi="Arial" w:eastAsia="Arial" w:cs="Arial"/>
                 <w:b/>
-                <w:sz w:val="22"/>
-                <w:szCs w:val="22"/>
-              </w:rPr>
-            </w:pPr>
-            <w:r>
-              <w:rPr>
-                <w:rFonts w:eastAsia="Times New Roman" w:cs="Arial" w:ascii="Arial" w:hAnsi="Arial"/>
-                <w:b/>
-                <w:kern w:val="0"/>
-                <w:sz w:val="15"/>
-                <w:szCs w:val="20"/>
-                <w:lang w:val="pt-BR" w:eastAsia="pt-BR" w:bidi="ar-SA"/>
-              </w:rPr>
-              <w:t xml:space="preserve">                        </w:t>
-            </w:r>
-            <w:r>
-              <w:rPr>
-                <w:rFonts w:eastAsia="Times New Roman" w:cs="Arial" w:ascii="Arial" w:hAnsi="Arial"/>
-                <w:b/>
-                <w:kern w:val="0"/>
-                <w:sz w:val="15"/>
-                <w:szCs w:val="20"/>
-                <w:lang w:val="pt-BR" w:eastAsia="pt-BR" w:bidi="ar-SA"/>
-              </w:rPr>
-              <w:t>{{placa}}</w:t>
+                <w:sz w:val="20"/>
+              </w:rPr>
+              <w:t>{placa}</w:t>
             </w:r>
           </w:p>
         </w:tc>
       </w:tr>
       <w:tr>
         <w:trPr>
-          <w:trHeight w:val="693" w:hRule="atLeast"/>
+          <w:trHeight w:val="425" w:hRule="atLeast"/>
         </w:trPr>
         <w:tc>
           <w:tcPr>
             <w:tcW w:w="10059" w:type="dxa"/>
             <w:gridSpan w:val="8"/>
             <w:tcBorders/>
+            <w:tcMar>
+              <w:top w:w="40" w:type="dxa"/>
+              <w:start w:w="50" w:type="dxa"/>
+              <w:bottom w:w="40" w:type="dxa"/>
+              <w:end w:w="50" w:type="dxa"/>
+            </w:tcMar>
+            <w:vAlign w:val="center"/>
           </w:tcPr>
           <w:p>
             <w:pPr>
-              <w:pStyle w:val="Normal"/>
-              <w:widowControl/>
-              <w:suppressAutoHyphens w:val="true"/>
-              <w:spacing w:before="0" w:after="0"/>
+              <w:keepNext w:val="0"/>
+              <w:spacing w:before="0" w:after="0" w:line="240" w:lineRule="auto"/>
               <w:jc w:val="center"/>
-              <w:rPr>
-                <w:rFonts w:ascii="Arial" w:hAnsi="Arial" w:cs="Arial"/>
+            </w:pPr>
+            <w:r>
+              <w:rPr>
+                <w:rFonts w:ascii="Arial" w:hAnsi="Arial" w:eastAsia="Arial" w:cs="Arial"/>
                 <w:b/>
-                <w:bCs/>
-              </w:rPr>
-            </w:pPr>
-            <w:r>
-              <w:rPr>
-                <w:rFonts w:eastAsia="Times New Roman" w:cs="Arial" w:ascii="Arial" w:hAnsi="Arial"/>
-                <w:b/>
-                <w:bCs/>
-                <w:kern w:val="0"/>
-                <w:sz w:val="20"/>
-                <w:szCs w:val="20"/>
-                <w:lang w:val="pt-BR" w:eastAsia="pt-BR" w:bidi="ar-SA"/>
+                <w:sz w:val="18"/>
               </w:rPr>
               <w:t>NOME DA PESSOA FALECIDA:</w:t>
             </w:r>
           </w:p>
           <w:p>
             <w:pPr>
-              <w:pStyle w:val="Normal"/>
-              <w:widowControl/>
-              <w:suppressAutoHyphens w:val="true"/>
-              <w:spacing w:before="0" w:after="0"/>
-              <w:jc w:val="start"/>
-              <w:rPr>
-                <w:rFonts w:ascii="Arial" w:hAnsi="Arial" w:cs="Arial"/>
+              <w:keepNext w:val="0"/>
+              <w:spacing w:before="0" w:after="0" w:line="240" w:lineRule="auto"/>
+              <w:jc w:val="center"/>
+            </w:pPr>
+            <w:r>
+              <w:rPr>
+                <w:rFonts w:ascii="Arial" w:hAnsi="Arial" w:eastAsia="Arial" w:cs="Arial"/>
                 <w:b/>
-                <w:bCs/>
                 <w:sz w:val="28"/>
-                <w:szCs w:val="28"/>
-              </w:rPr>
-            </w:pPr>
-            <w:r>
-              <w:rPr>
-                <w:rFonts w:eastAsia="Times New Roman" w:cs="Arial" w:ascii="Arial" w:hAnsi="Arial"/>
-                <w:b/>
-                <w:bCs/>
-                <w:kern w:val="0"/>
-                <w:sz w:val="28"/>
-                <w:szCs w:val="28"/>
-                <w:lang w:val="pt-BR" w:eastAsia="pt-BR" w:bidi="ar-SA"/>
-              </w:rPr>
-              <w:t xml:space="preserve">                                </w:t>
-            </w:r>
-            <w:r>
-              <w:rPr>
-                <w:rFonts w:eastAsia="Times New Roman" w:cs="Arial" w:ascii="Arial" w:hAnsi="Arial"/>
-                <w:b/>
-                <w:bCs/>
-                <w:kern w:val="0"/>
-                <w:sz w:val="28"/>
-                <w:szCs w:val="28"/>
-                <w:lang w:val="pt-BR" w:eastAsia="pt-BR" w:bidi="ar-SA"/>
-              </w:rPr>
-              <w:t>{{nomeFal}}</w:t>
+              </w:rPr>
+              <w:t>{nomeFal}</w:t>
             </w:r>
           </w:p>
         </w:tc>
       </w:tr>
       <w:tr>
         <w:trPr>
-          <w:trHeight w:val="734" w:hRule="atLeast"/>
+          <w:trHeight w:val="482" w:hRule="atLeast"/>
         </w:trPr>
         <w:tc>
           <w:tcPr>
             <w:tcW w:w="5949" w:type="dxa"/>
             <w:gridSpan w:val="5"/>
             <w:tcBorders/>
+            <w:tcMar>
+              <w:top w:w="40" w:type="dxa"/>
+              <w:start w:w="50" w:type="dxa"/>
+              <w:bottom w:w="40" w:type="dxa"/>
+              <w:end w:w="50" w:type="dxa"/>
+            </w:tcMar>
+            <w:vAlign w:val="center"/>
           </w:tcPr>
           <w:p>
             <w:pPr>
-              <w:pStyle w:val="Normal"/>
-              <w:widowControl/>
-              <w:suppressAutoHyphens w:val="true"/>
-              <w:spacing w:before="0" w:after="0"/>
-              <w:jc w:val="start"/>
-              <w:rPr>
-                <w:rFonts w:ascii="Arial" w:hAnsi="Arial" w:cs="Arial"/>
-              </w:rPr>
+              <w:keepNext w:val="0"/>
+              <w:spacing w:before="0" w:after="0" w:line="240" w:lineRule="auto"/>
+              <w:jc w:val="center"/>
             </w:pPr>
             <w:r>
               <w:rPr>
-                <w:rFonts w:eastAsia="Times New Roman" w:cs="Arial" w:ascii="Arial" w:hAnsi="Arial"/>
-                <w:kern w:val="0"/>
-                <w:sz w:val="20"/>
-                <w:szCs w:val="20"/>
-                <w:lang w:val="pt-BR" w:eastAsia="pt-BR" w:bidi="ar-SA"/>
-              </w:rPr>
-              <w:t xml:space="preserve">                                     </w:t>
-            </w:r>
-            <w:r>
-              <w:rPr>
-                <w:rFonts w:eastAsia="Times New Roman" w:cs="Arial" w:ascii="Arial" w:hAnsi="Arial"/>
-                <w:kern w:val="0"/>
-                <w:sz w:val="20"/>
-                <w:szCs w:val="20"/>
-                <w:lang w:val="pt-BR" w:eastAsia="pt-BR" w:bidi="ar-SA"/>
-              </w:rPr>
-              <w:t>AGENDAMENTO</w:t>
+                <w:rFonts w:ascii="Arial" w:hAnsi="Arial" w:eastAsia="Arial" w:cs="Arial"/>
+                <w:sz w:val="18"/>
+              </w:rPr>
+              <w:t>AGENDAMENTO DA EXUMAÇÃO:</w:t>
             </w:r>
           </w:p>
           <w:p>
             <w:pPr>
-              <w:pStyle w:val="Normal"/>
-              <w:widowControl/>
-              <w:suppressAutoHyphens w:val="true"/>
-              <w:spacing w:before="0" w:after="0"/>
-              <w:jc w:val="start"/>
-              <w:rPr>
-                <w:rFonts w:ascii="Arial" w:hAnsi="Arial" w:cs="Arial"/>
+              <w:keepNext w:val="0"/>
+              <w:spacing w:before="0" w:after="0" w:line="240" w:lineRule="auto"/>
+              <w:jc w:val="center"/>
+            </w:pPr>
+            <w:r>
+              <w:rPr>
+                <w:rFonts w:ascii="Arial" w:hAnsi="Arial" w:eastAsia="Arial" w:cs="Arial"/>
                 <w:b/>
-                <w:bCs/>
-                <w:color w:val="FF0000"/>
-                <w:sz w:val="28"/>
-                <w:szCs w:val="28"/>
-                <w:highlight w:val="yellow"/>
-              </w:rPr>
-            </w:pPr>
-            <w:r>
-              <w:rPr>
-                <w:rFonts w:eastAsia="Times New Roman" w:cs="Arial" w:ascii="Arial" w:hAnsi="Arial"/>
-                <w:b/>
-                <w:bCs/>
-                <w:color w:val="FF0000"/>
-                <w:kern w:val="0"/>
-                <w:sz w:val="15"/>
-                <w:szCs w:val="28"/>
-                <w:lang w:val="pt-BR" w:eastAsia="pt-BR" w:bidi="ar-SA"/>
-              </w:rPr>
-              <w:t xml:space="preserve">                 </w:t>
-            </w:r>
-            <w:r>
-              <w:rPr>
-                <w:rFonts w:eastAsia="Times New Roman" w:cs="Arial" w:ascii="Arial" w:hAnsi="Arial"/>
-                <w:b/>
-                <w:bCs/>
-                <w:color w:val="FF0000"/>
-                <w:kern w:val="0"/>
-                <w:sz w:val="15"/>
-                <w:szCs w:val="28"/>
-                <w:lang w:val="pt-BR" w:eastAsia="pt-BR" w:bidi="ar-SA"/>
-              </w:rPr>
-              <w:t>{{dataAg}} ÀS {{horaAg}}</w:t>
+                <w:sz w:val="20"/>
+              </w:rPr>
+              <w:t>{dataAg}  {horaAg}</w:t>
             </w:r>
           </w:p>
         </w:tc>
@@ -1051,233 +437,68 @@
             <w:tcW w:w="4110" w:type="dxa"/>
             <w:gridSpan w:val="3"/>
             <w:tcBorders/>
+            <w:tcMar>
+              <w:top w:w="40" w:type="dxa"/>
+              <w:start w:w="50" w:type="dxa"/>
+              <w:bottom w:w="40" w:type="dxa"/>
+              <w:end w:w="50" w:type="dxa"/>
+            </w:tcMar>
+            <w:vAlign w:val="center"/>
           </w:tcPr>
           <w:p>
             <w:pPr>
-              <w:pStyle w:val="Normal"/>
-              <w:widowControl/>
-              <w:suppressAutoHyphens w:val="true"/>
-              <w:spacing w:before="0" w:after="0"/>
+              <w:keepNext w:val="0"/>
+              <w:spacing w:before="0" w:after="0" w:line="240" w:lineRule="auto"/>
               <w:jc w:val="center"/>
-              <w:rPr>
-                <w:rFonts w:ascii="Arial" w:hAnsi="Arial" w:cs="Arial"/>
+            </w:pPr>
+            <w:r>
+              <w:rPr>
+                <w:rFonts w:ascii="Arial" w:hAnsi="Arial" w:eastAsia="Arial" w:cs="Arial"/>
                 <w:sz w:val="18"/>
-                <w:szCs w:val="18"/>
-              </w:rPr>
-            </w:pPr>
-            <w:r>
-              <w:rPr>
-                <w:rFonts w:eastAsia="Times New Roman" w:cs="Arial" w:ascii="Arial" w:hAnsi="Arial"/>
-                <w:kern w:val="0"/>
-                <w:sz w:val="18"/>
-                <w:szCs w:val="18"/>
-                <w:lang w:val="pt-BR" w:eastAsia="pt-BR" w:bidi="ar-SA"/>
               </w:rPr>
               <w:t>Família Presente:</w:t>
             </w:r>
           </w:p>
           <w:p>
             <w:pPr>
-              <w:pStyle w:val="Normal"/>
-              <w:widowControl/>
-              <w:suppressAutoHyphens w:val="true"/>
-              <w:spacing w:before="0" w:after="0"/>
+              <w:keepNext w:val="0"/>
+              <w:spacing w:before="0" w:after="0" w:line="240" w:lineRule="auto"/>
               <w:jc w:val="center"/>
-              <w:rPr>
-                <w:rFonts w:ascii="Arial" w:hAnsi="Arial" w:cs="Arial"/>
+            </w:pPr>
+            <w:r>
+              <w:rPr>
+                <w:rFonts w:ascii="Arial" w:hAnsi="Arial" w:eastAsia="Arial" w:cs="Arial"/>
                 <w:sz w:val="18"/>
-                <w:szCs w:val="18"/>
-              </w:rPr>
-            </w:pPr>
-            <w:r>
-              <w:rPr>
-                <w:rFonts w:cs="Arial" w:ascii="Arial" w:hAnsi="Arial"/>
-                <w:sz w:val="18"/>
-                <w:szCs w:val="18"/>
-              </w:rPr>
-            </w:r>
-          </w:p>
-          <w:p>
-            <w:pPr>
-              <w:pStyle w:val="Normal"/>
-              <w:widowControl/>
-              <w:tabs>
-                <w:tab w:val="clear" w:pos="709"/>
-                <w:tab w:val="left" w:pos="1044" w:leader="none"/>
-              </w:tabs>
-              <w:suppressAutoHyphens w:val="true"/>
-              <w:spacing w:before="0" w:after="0"/>
-              <w:jc w:val="center"/>
-              <w:rPr>
-                <w:rFonts w:ascii="Arial" w:hAnsi="Arial" w:cs="Arial"/>
-                <w:highlight w:val="yellow"/>
-              </w:rPr>
-            </w:pPr>
-            <w:r>
-              <mc:AlternateContent>
-                <mc:Choice Requires="wps">
-                  <w:drawing>
-                    <wp:anchor behindDoc="0" distT="12700" distB="12700" distL="12700" distR="12700" simplePos="0" locked="0" layoutInCell="1" allowOverlap="1" relativeHeight="11" wp14:anchorId="1AEDD492">
-                      <wp:simplePos x="0" y="0"/>
-                      <wp:positionH relativeFrom="column">
-                        <wp:posOffset>1247140</wp:posOffset>
-                      </wp:positionH>
-                      <wp:positionV relativeFrom="paragraph">
-                        <wp:posOffset>20955</wp:posOffset>
-                      </wp:positionV>
-                      <wp:extent cx="144780" cy="134620"/>
-                      <wp:effectExtent l="12700" t="12700" r="12700" b="12700"/>
-                      <wp:wrapNone/>
-                      <wp:docPr id="7" name="Retângulo 1"/>
-                      <a:graphic xmlns:a="http://schemas.openxmlformats.org/drawingml/2006/main">
-                        <a:graphicData uri="http://schemas.microsoft.com/office/word/2010/wordprocessingShape">
-                          <wps:wsp>
-                            <wps:cNvSpPr/>
-                            <wps:spPr>
-                              <a:xfrm>
-                                <a:off x="0" y="0"/>
-                                <a:ext cx="144720" cy="134640"/>
-                              </a:xfrm>
-                              <a:prstGeom prst="rect">
-                                <a:avLst/>
-                              </a:prstGeom>
-                              <a:solidFill>
-                                <a:srgbClr val="ffffff"/>
-                              </a:solidFill>
-                              <a:ln>
-                                <a:solidFill>
-                                  <a:srgbClr val="4f81bd"/>
-                                </a:solidFill>
-                                <a:round/>
-                              </a:ln>
-                            </wps:spPr>
-                            <wps:style>
-                              <a:lnRef idx="2">
-                                <a:schemeClr val="accent1"/>
-                              </a:lnRef>
-                              <a:fillRef idx="1">
-                                <a:schemeClr val="lt1"/>
-                              </a:fillRef>
-                              <a:effectRef idx="0">
-                                <a:schemeClr val="accent1"/>
-                              </a:effectRef>
-                              <a:fontRef idx="minor"/>
-                            </wps:style>
-                            <wps:bodyPr/>
-                          </wps:wsp>
-                        </a:graphicData>
-                      </a:graphic>
-                    </wp:anchor>
-                  </w:drawing>
-                </mc:Choice>
-                <mc:Fallback>
-                  <w:pict>
-                    <v:rect id="shape_0" ID="Retângulo 1" path="m0,0l-2147483645,0l-2147483645,-2147483646l0,-2147483646xe" fillcolor="white" stroked="t" o:allowincell="f" style="position:absolute;margin-left:98.2pt;margin-top:1.65pt;width:11.35pt;height:10.55pt;mso-wrap-style:none;v-text-anchor:middle" wp14:anchorId="1AEDD492">
-                      <v:fill o:detectmouseclick="t" type="solid" color2="black"/>
-                      <v:stroke color="#4f81bd" weight="25560" joinstyle="round" endcap="flat"/>
-                      <w10:wrap type="none"/>
-                    </v:rect>
-                  </w:pict>
-                </mc:Fallback>
-              </mc:AlternateContent>
-              <mc:AlternateContent>
-                <mc:Choice Requires="wps">
-                  <w:drawing>
-                    <wp:anchor behindDoc="0" distT="12700" distB="12700" distL="12700" distR="12700" simplePos="0" locked="0" layoutInCell="1" allowOverlap="1" relativeHeight="12" wp14:anchorId="33A32E8C">
-                      <wp:simplePos x="0" y="0"/>
-                      <wp:positionH relativeFrom="column">
-                        <wp:posOffset>551815</wp:posOffset>
-                      </wp:positionH>
-                      <wp:positionV relativeFrom="paragraph">
-                        <wp:posOffset>22860</wp:posOffset>
-                      </wp:positionV>
-                      <wp:extent cx="144780" cy="134620"/>
-                      <wp:effectExtent l="12700" t="12700" r="12700" b="12700"/>
-                      <wp:wrapNone/>
-                      <wp:docPr id="8" name="Retângulo 1"/>
-                      <a:graphic xmlns:a="http://schemas.openxmlformats.org/drawingml/2006/main">
-                        <a:graphicData uri="http://schemas.microsoft.com/office/word/2010/wordprocessingShape">
-                          <wps:wsp>
-                            <wps:cNvSpPr/>
-                            <wps:spPr>
-                              <a:xfrm>
-                                <a:off x="0" y="0"/>
-                                <a:ext cx="144720" cy="134640"/>
-                              </a:xfrm>
-                              <a:prstGeom prst="rect">
-                                <a:avLst/>
-                              </a:prstGeom>
-                              <a:solidFill>
-                                <a:schemeClr val="bg1"/>
-                              </a:solidFill>
-                              <a:ln>
-                                <a:solidFill>
-                                  <a:srgbClr val="000000"/>
-                                </a:solidFill>
-                                <a:round/>
-                              </a:ln>
-                            </wps:spPr>
-                            <wps:style>
-                              <a:lnRef idx="2">
-                                <a:schemeClr val="dk1">
-                                  <a:shade val="15000"/>
-                                </a:schemeClr>
-                              </a:lnRef>
-                              <a:fillRef idx="1">
-                                <a:schemeClr val="lt1"/>
-                              </a:fillRef>
-                              <a:effectRef idx="0">
-                                <a:schemeClr val="dk1"/>
-                              </a:effectRef>
-                              <a:fontRef idx="minor"/>
-                            </wps:style>
-                            <wps:bodyPr/>
-                          </wps:wsp>
-                        </a:graphicData>
-                      </a:graphic>
-                    </wp:anchor>
-                  </w:drawing>
-                </mc:Choice>
-                <mc:Fallback>
-                  <w:pict>
-                    <v:rect id="shape_0" ID="Retângulo 1" path="m0,0l-2147483645,0l-2147483645,-2147483646l0,-2147483646xe" fillcolor="white" stroked="t" o:allowincell="f" style="position:absolute;margin-left:43.45pt;margin-top:1.8pt;width:11.35pt;height:10.55pt;mso-wrap-style:none;v-text-anchor:middle" wp14:anchorId="33A32E8C">
-                      <v:fill o:detectmouseclick="t" type="solid" color2="black"/>
-                      <v:stroke color="black" weight="25560" joinstyle="round" endcap="flat"/>
-                      <w10:wrap type="none"/>
-                    </v:rect>
-                  </w:pict>
-                </mc:Fallback>
-              </mc:AlternateContent>
-            </w:r>
-            <w:r>
-              <w:rPr>
-                <w:rFonts w:eastAsia="Times New Roman" w:cs="Arial" w:ascii="Arial" w:hAnsi="Arial"/>
-                <w:kern w:val="0"/>
-                <w:sz w:val="20"/>
-                <w:szCs w:val="20"/>
-                <w:lang w:val="pt-BR" w:eastAsia="pt-BR" w:bidi="ar-SA"/>
-              </w:rPr>
-              <w:t>Sim             Não</w:t>
+              </w:rPr>
+              <w:t>□ Sim      □ Não</w:t>
             </w:r>
           </w:p>
         </w:tc>
       </w:tr>
       <w:tr>
         <w:trPr>
-          <w:trHeight w:val="228" w:hRule="atLeast"/>
+          <w:trHeight w:val="227" w:hRule="atLeast"/>
         </w:trPr>
         <w:tc>
           <w:tcPr>
             <w:tcW w:w="10059" w:type="dxa"/>
             <w:gridSpan w:val="8"/>
             <w:tcBorders/>
+            <w:tcMar>
+              <w:top w:w="40" w:type="dxa"/>
+              <w:start w:w="50" w:type="dxa"/>
+              <w:bottom w:w="40" w:type="dxa"/>
+              <w:end w:w="50" w:type="dxa"/>
+            </w:tcMar>
+            <w:vAlign w:val="center"/>
           </w:tcPr>
           <w:p>
             <w:pPr>
               <w:pStyle w:val="Normal"/>
+              <w:keepNext w:val="0"/>
               <w:widowControl/>
               <w:suppressAutoHyphens w:val="true"/>
-              <w:spacing w:before="0" w:after="0"/>
+              <w:spacing w:before="0" w:after="0" w:line="240" w:lineRule="auto"/>
               <w:jc w:val="center"/>
               <w:rPr>
                 <w:rFonts w:ascii="Arial" w:hAnsi="Arial" w:cs="Arial"/>
@@ -1288,13 +509,9 @@
             </w:pPr>
             <w:r>
               <w:rPr>
-                <w:rFonts w:eastAsia="Times New Roman" w:cs="Arial" w:ascii="Arial" w:hAnsi="Arial"/>
+                <w:rFonts w:ascii="Arial" w:hAnsi="Arial" w:eastAsia="Arial" w:cs="Arial"/>
                 <w:b/>
-                <w:bCs/>
-                <w:kern w:val="0"/>
                 <w:sz w:val="20"/>
-                <w:szCs w:val="20"/>
-                <w:lang w:val="pt-BR" w:eastAsia="pt-BR" w:bidi="ar-SA"/>
               </w:rPr>
               <w:t>AUTORIZAÇÃO DE EXUMAÇÃO</w:t>
             </w:r>
@@ -1303,376 +520,193 @@
       </w:tr>
       <w:tr>
         <w:trPr>
-          <w:trHeight w:val="4965" w:hRule="atLeast"/>
+          <w:trHeight w:val="2211" w:hRule="atLeast"/>
         </w:trPr>
         <w:tc>
           <w:tcPr>
             <w:tcW w:w="10059" w:type="dxa"/>
             <w:gridSpan w:val="8"/>
             <w:tcBorders/>
+            <w:vAlign w:val="center"/>
+            <w:tcMar>
+              <w:top w:w="40" w:type="dxa"/>
+              <w:start w:w="50" w:type="dxa"/>
+              <w:bottom w:w="40" w:type="dxa"/>
+              <w:end w:w="50" w:type="dxa"/>
+            </w:tcMar>
           </w:tcPr>
           <w:p>
             <w:pPr>
-              <w:pStyle w:val="Normal"/>
-              <w:widowControl/>
-              <w:suppressAutoHyphens w:val="true"/>
-              <w:spacing w:before="0" w:after="0"/>
-              <w:jc w:val="center"/>
-              <w:rPr>
-                <w:rFonts w:ascii="Arial" w:hAnsi="Arial" w:cs="Arial"/>
+              <w:keepNext w:val="0"/>
+              <w:spacing w:before="0" w:after="0" w:line="240" w:lineRule="auto"/>
+            </w:pPr>
+            <w:r>
+              <w:rPr>
+                <w:rFonts w:ascii="Arial" w:hAnsi="Arial" w:eastAsia="Arial" w:cs="Arial"/>
+                <w:sz w:val="18"/>
+              </w:rPr>
+              <w:t xml:space="preserve">Eu, </w:t>
+            </w:r>
+            <w:r>
+              <w:rPr>
+                <w:rFonts w:ascii="Arial" w:hAnsi="Arial" w:eastAsia="Arial" w:cs="Arial"/>
                 <w:b/>
-                <w:bCs/>
-              </w:rPr>
-            </w:pPr>
-            <w:r>
-              <w:rPr>
-                <w:rFonts w:cs="Arial" w:ascii="Arial" w:hAnsi="Arial"/>
+                <w:sz w:val="18"/>
+              </w:rPr>
+              <w:t>{nomeResp}</w:t>
+            </w:r>
+            <w:r>
+              <w:rPr>
+                <w:rFonts w:ascii="Arial" w:hAnsi="Arial" w:eastAsia="Arial" w:cs="Arial"/>
+                <w:sz w:val="18"/>
+              </w:rPr>
+              <w:t xml:space="preserve"> CPF: </w:t>
+            </w:r>
+            <w:r>
+              <w:rPr>
+                <w:rFonts w:ascii="Arial" w:hAnsi="Arial" w:eastAsia="Arial" w:cs="Arial"/>
                 <w:b/>
-                <w:bCs/>
-              </w:rPr>
+                <w:sz w:val="18"/>
+              </w:rPr>
+              <w:t>{cpfResp}</w:t>
             </w:r>
           </w:p>
           <w:p>
             <w:pPr>
-              <w:pStyle w:val="Normal"/>
-              <w:widowControl/>
-              <w:suppressAutoHyphens w:val="true"/>
-              <w:spacing w:lineRule="auto" w:line="480" w:before="0" w:after="0"/>
-              <w:jc w:val="both"/>
-              <w:rPr>
-                <w:rFonts w:ascii="Arial" w:hAnsi="Arial" w:cs="Arial"/>
-              </w:rPr>
+              <w:keepNext w:val="0"/>
+              <w:spacing w:before="0" w:after="0" w:line="240" w:lineRule="auto"/>
             </w:pPr>
             <w:r>
               <w:rPr>
-                <w:rFonts w:eastAsia="Times New Roman" w:cs="Arial" w:ascii="Arial" w:hAnsi="Arial"/>
-                <w:kern w:val="0"/>
-                <w:sz w:val="20"/>
-                <w:szCs w:val="20"/>
-                <w:lang w:val="pt-BR" w:eastAsia="pt-BR" w:bidi="ar-SA"/>
-              </w:rPr>
-              <w:t xml:space="preserve">Eu, </w:t>
-            </w:r>
-            <w:r>
-              <w:rPr>
-                <w:rFonts w:eastAsia="Times New Roman" w:cs="Arial" w:ascii="Arial" w:hAnsi="Arial"/>
-                <w:b/>
-                <w:bCs/>
-                <w:kern w:val="0"/>
-                <w:sz w:val="20"/>
-                <w:szCs w:val="20"/>
-                <w:lang w:val="pt-BR" w:eastAsia="pt-BR" w:bidi="ar-SA"/>
-              </w:rPr>
-              <w:t xml:space="preserve">{{nomeResp}} </w:t>
-            </w:r>
-            <w:r>
-              <w:rPr>
-                <w:rFonts w:eastAsia="Times New Roman" w:cs="Arial" w:ascii="Arial" w:hAnsi="Arial"/>
-                <w:kern w:val="0"/>
-                <w:sz w:val="20"/>
-                <w:szCs w:val="20"/>
-                <w:lang w:val="pt-BR" w:eastAsia="pt-BR" w:bidi="ar-SA"/>
-              </w:rPr>
-              <w:t>RG:</w:t>
-            </w:r>
-            <w:bookmarkStart w:id="0" w:name="_Hlk191539510"/>
-            <w:bookmarkStart w:id="1" w:name="_Hlk194666790"/>
-            <w:r>
-              <w:rPr>
-                <w:rFonts w:eastAsia="Times New Roman" w:cs="Arial" w:ascii="Arial" w:hAnsi="Arial"/>
-                <w:b/>
-                <w:bCs/>
-                <w:kern w:val="0"/>
-                <w:sz w:val="20"/>
-                <w:szCs w:val="20"/>
-                <w:lang w:val="pt-BR" w:eastAsia="pt-BR" w:bidi="ar-SA"/>
-              </w:rPr>
-              <w:t xml:space="preserve"> {{rgResp}} </w:t>
-            </w:r>
-            <w:r>
-              <w:rPr>
-                <w:rFonts w:eastAsia="Times New Roman" w:cs="Arial" w:ascii="Arial" w:hAnsi="Arial"/>
-                <w:kern w:val="0"/>
-                <w:sz w:val="20"/>
-                <w:szCs w:val="20"/>
-                <w:lang w:val="pt-BR" w:eastAsia="pt-BR" w:bidi="ar-SA"/>
-              </w:rPr>
-              <w:t>CPF:</w:t>
-            </w:r>
-            <w:r>
-              <w:rPr>
-                <w:rFonts w:eastAsia="Times New Roman" w:cs="Arial" w:ascii="Arial" w:hAnsi="Arial"/>
-                <w:b/>
-                <w:bCs/>
-                <w:kern w:val="0"/>
-                <w:sz w:val="20"/>
-                <w:szCs w:val="20"/>
-                <w:lang w:val="pt-BR" w:eastAsia="pt-BR" w:bidi="ar-SA"/>
-              </w:rPr>
-              <w:t xml:space="preserve"> {{cpfResp}}</w:t>
+                <w:rFonts w:ascii="Arial" w:hAnsi="Arial" w:eastAsia="Arial" w:cs="Arial"/>
+                <w:sz w:val="18"/>
+              </w:rPr>
+              <w:t>Profissão: ____________________</w:t>
             </w:r>
           </w:p>
           <w:p>
             <w:pPr>
-              <w:pStyle w:val="Normal"/>
-              <w:widowControl/>
-              <w:suppressAutoHyphens w:val="true"/>
-              <w:spacing w:lineRule="auto" w:line="480" w:before="0" w:after="0"/>
-              <w:jc w:val="both"/>
-              <w:rPr>
-                <w:rFonts w:ascii="Arial" w:hAnsi="Arial" w:cs="Arial"/>
-              </w:rPr>
+              <w:keepNext w:val="0"/>
+              <w:spacing w:before="0" w:after="0" w:line="240" w:lineRule="auto"/>
             </w:pPr>
-            <w:bookmarkStart w:id="2" w:name="_Hlk194666850"/>
-            <w:bookmarkEnd w:id="0"/>
-            <w:bookmarkEnd w:id="1"/>
-            <w:r>
-              <w:rPr>
-                <w:rFonts w:eastAsia="Times New Roman" w:cs="Arial" w:ascii="Arial" w:hAnsi="Arial"/>
-                <w:kern w:val="0"/>
-                <w:sz w:val="20"/>
-                <w:szCs w:val="20"/>
-                <w:lang w:val="pt-BR" w:eastAsia="pt-BR" w:bidi="ar-SA"/>
+            <w:r>
+              <w:rPr>
+                <w:rFonts w:ascii="Arial" w:hAnsi="Arial" w:eastAsia="Arial" w:cs="Arial"/>
+                <w:sz w:val="18"/>
               </w:rPr>
               <w:t xml:space="preserve">Endereço: </w:t>
             </w:r>
             <w:r>
               <w:rPr>
-                <w:rFonts w:eastAsia="Times New Roman" w:cs="Arial" w:ascii="Arial" w:hAnsi="Arial"/>
+                <w:rFonts w:ascii="Arial" w:hAnsi="Arial" w:eastAsia="Arial" w:cs="Arial"/>
                 <w:b/>
-                <w:bCs/>
-                <w:kern w:val="0"/>
-                <w:sz w:val="20"/>
-                <w:szCs w:val="20"/>
-                <w:lang w:val="pt-BR" w:eastAsia="pt-BR" w:bidi="ar-SA"/>
-              </w:rPr>
-              <w:t>{{endResp}} Telefone: {{telResp}}</w:t>
-            </w:r>
-            <w:bookmarkEnd w:id="2"/>
-            <w:r>
-              <w:rPr>
-                <w:rFonts w:eastAsia="Times New Roman" w:cs="Arial" w:ascii="Arial" w:hAnsi="Arial"/>
-                <w:b/>
-                <w:bCs/>
-                <w:kern w:val="0"/>
-                <w:sz w:val="22"/>
-                <w:szCs w:val="22"/>
-                <w:lang w:val="pt-BR" w:eastAsia="pt-BR" w:bidi="ar-SA"/>
-              </w:rPr>
-              <w:t xml:space="preserve"> </w:t>
-            </w:r>
-            <w:r>
-              <w:rPr>
-                <w:rFonts w:eastAsia="Times New Roman" w:cs="Arial" w:ascii="Arial" w:hAnsi="Arial"/>
-                <w:kern w:val="0"/>
-                <w:sz w:val="22"/>
-                <w:szCs w:val="22"/>
-                <w:lang w:val="pt-BR" w:eastAsia="pt-BR" w:bidi="ar-SA"/>
-              </w:rPr>
-              <w:t xml:space="preserve"> </w:t>
+                <w:sz w:val="18"/>
+              </w:rPr>
+              <w:t>{endResp}</w:t>
             </w:r>
           </w:p>
           <w:p>
             <w:pPr>
-              <w:pStyle w:val="Normal"/>
-              <w:widowControl/>
-              <w:suppressAutoHyphens w:val="true"/>
-              <w:spacing w:lineRule="auto" w:line="480" w:before="0" w:after="0"/>
-              <w:jc w:val="both"/>
-              <w:rPr>
-                <w:rFonts w:ascii="Arial" w:hAnsi="Arial" w:cs="Arial"/>
-                <w:sz w:val="22"/>
-                <w:szCs w:val="22"/>
-              </w:rPr>
+              <w:keepNext w:val="0"/>
+              <w:spacing w:before="0" w:after="0" w:line="240" w:lineRule="auto"/>
             </w:pPr>
             <w:r>
               <w:rPr>
-                <w:rFonts w:eastAsia="Times New Roman" w:cs="Arial" w:ascii="Arial" w:hAnsi="Arial"/>
-                <w:kern w:val="0"/>
-                <w:sz w:val="15"/>
-                <w:szCs w:val="22"/>
-                <w:lang w:val="pt-BR" w:eastAsia="pt-BR" w:bidi="ar-SA"/>
-              </w:rPr>
-              <w:t xml:space="preserve">Na qualidade de {{parent}} autorizo a exumação junto à administração do Cemitério Santana, nesta data. </w:t>
+                <w:rFonts w:ascii="Arial" w:hAnsi="Arial" w:eastAsia="Arial" w:cs="Arial"/>
+                <w:sz w:val="18"/>
+              </w:rPr>
+              <w:t xml:space="preserve">Telefone: </w:t>
+            </w:r>
+            <w:r>
+              <w:rPr>
+                <w:rFonts w:ascii="Arial" w:hAnsi="Arial" w:eastAsia="Arial" w:cs="Arial"/>
+                <w:b/>
+                <w:sz w:val="18"/>
+              </w:rPr>
+              <w:t>{telResp}</w:t>
             </w:r>
           </w:p>
           <w:p>
             <w:pPr>
-              <w:pStyle w:val="Normal"/>
-              <w:widowControl/>
-              <w:suppressAutoHyphens w:val="true"/>
-              <w:spacing w:before="0" w:after="0"/>
-              <w:jc w:val="both"/>
-              <w:rPr>
-                <w:rFonts w:ascii="Arial" w:hAnsi="Arial" w:cs="Arial"/>
-              </w:rPr>
+              <w:keepNext w:val="0"/>
+              <w:spacing w:before="0" w:after="0" w:line="240" w:lineRule="auto"/>
             </w:pPr>
             <w:r>
               <w:rPr>
-                <w:rFonts w:cs="Arial" w:ascii="Arial" w:hAnsi="Arial"/>
-              </w:rPr>
+                <w:rFonts w:ascii="Arial" w:hAnsi="Arial" w:eastAsia="Arial" w:cs="Arial"/>
+                <w:sz w:val="18"/>
+              </w:rPr>
+              <w:t xml:space="preserve">Na qualidade de </w:t>
+            </w:r>
+            <w:r>
+              <w:rPr>
+                <w:rFonts w:ascii="Arial" w:hAnsi="Arial" w:eastAsia="Arial" w:cs="Arial"/>
+                <w:b/>
+                <w:sz w:val="18"/>
+              </w:rPr>
+              <w:t>{parent}</w:t>
+            </w:r>
+            <w:r>
+              <w:rPr>
+                <w:rFonts w:ascii="Arial" w:hAnsi="Arial" w:eastAsia="Arial" w:cs="Arial"/>
+                <w:sz w:val="18"/>
+              </w:rPr>
+              <w:t xml:space="preserve"> autorizo a exumação junto à administração do Cemitério Santana, nesta data.</w:t>
             </w:r>
           </w:p>
           <w:p>
             <w:pPr>
-              <w:pStyle w:val="Normal"/>
-              <w:widowControl/>
-              <w:suppressAutoHyphens w:val="true"/>
-              <w:spacing w:before="0" w:after="0"/>
-              <w:jc w:val="both"/>
-              <w:rPr>
-                <w:rFonts w:ascii="Arial" w:hAnsi="Arial" w:cs="Arial"/>
+              <w:keepNext w:val="0"/>
+              <w:spacing w:before="0" w:after="0" w:line="240" w:lineRule="auto"/>
+            </w:pPr>
+            <w:r>
+              <w:rPr>
+                <w:rFonts w:ascii="Arial" w:hAnsi="Arial" w:eastAsia="Arial" w:cs="Arial"/>
                 <w:sz w:val="18"/>
-                <w:szCs w:val="18"/>
-              </w:rPr>
-            </w:pPr>
-            <w:r>
-              <w:rPr>
-                <w:rFonts w:cs="Arial" w:ascii="Arial" w:hAnsi="Arial"/>
-                <w:sz w:val="18"/>
-                <w:szCs w:val="18"/>
-              </w:rPr>
+              </w:rPr>
+              <w:t>Assinatura do Responsável pela Autorização: _________________________________________________</w:t>
             </w:r>
           </w:p>
           <w:p>
             <w:pPr>
-              <w:pStyle w:val="Normal"/>
-              <w:widowControl/>
-              <w:suppressAutoHyphens w:val="true"/>
-              <w:spacing w:before="0" w:after="0"/>
-              <w:jc w:val="start"/>
-              <w:rPr>
-                <w:rFonts w:ascii="Arial" w:hAnsi="Arial" w:cs="Arial"/>
-                <w:sz w:val="22"/>
-                <w:szCs w:val="22"/>
-              </w:rPr>
+              <w:keepNext w:val="0"/>
+              <w:spacing w:before="0" w:after="0" w:line="240" w:lineRule="auto"/>
+              <w:jc w:val="center"/>
             </w:pPr>
             <w:r>
               <w:rPr>
-                <w:rFonts w:eastAsia="Times New Roman" w:cs="Arial" w:ascii="Arial" w:hAnsi="Arial"/>
-                <w:kern w:val="0"/>
-                <w:sz w:val="20"/>
-                <w:szCs w:val="20"/>
-                <w:lang w:val="pt-BR" w:eastAsia="pt-BR" w:bidi="ar-SA"/>
-              </w:rPr>
-              <w:t>Assinatura do Responsável pela Autorização</w:t>
-            </w:r>
-            <w:r>
-              <w:rPr>
-                <w:rFonts w:eastAsia="Times New Roman" w:cs="Arial" w:ascii="Arial" w:hAnsi="Arial"/>
-                <w:kern w:val="0"/>
-                <w:sz w:val="22"/>
-                <w:szCs w:val="22"/>
-                <w:lang w:val="pt-BR" w:eastAsia="pt-BR" w:bidi="ar-SA"/>
-              </w:rPr>
-              <w:t>: ______________________________________________.</w:t>
-            </w:r>
-          </w:p>
-          <w:p>
-            <w:pPr>
-              <w:pStyle w:val="Normal"/>
-              <w:widowControl/>
-              <w:suppressAutoHyphens w:val="true"/>
-              <w:spacing w:before="0" w:after="0"/>
-              <w:jc w:val="start"/>
-              <w:rPr>
-                <w:rFonts w:ascii="Arial" w:hAnsi="Arial" w:cs="Arial"/>
+                <w:rFonts w:ascii="Arial" w:hAnsi="Arial" w:eastAsia="Arial" w:cs="Arial"/>
                 <w:sz w:val="18"/>
-                <w:szCs w:val="18"/>
-              </w:rPr>
-            </w:pPr>
-            <w:r>
-              <w:rPr>
-                <w:rFonts w:cs="Arial" w:ascii="Arial" w:hAnsi="Arial"/>
-                <w:sz w:val="18"/>
-                <w:szCs w:val="18"/>
-              </w:rPr>
-            </w:r>
-          </w:p>
-          <w:p>
-            <w:pPr>
-              <w:pStyle w:val="Normal"/>
-              <w:widowControl/>
-              <w:suppressAutoHyphens w:val="true"/>
-              <w:spacing w:before="0" w:after="0"/>
-              <w:jc w:val="start"/>
-              <w:rPr>
-                <w:rFonts w:ascii="Arial" w:hAnsi="Arial" w:cs="Arial"/>
-                <w:sz w:val="18"/>
-                <w:szCs w:val="18"/>
-              </w:rPr>
-            </w:pPr>
-            <w:r>
-              <w:rPr>
-                <w:rFonts w:cs="Arial" w:ascii="Arial" w:hAnsi="Arial"/>
-                <w:sz w:val="18"/>
-                <w:szCs w:val="18"/>
-              </w:rPr>
-            </w:r>
-          </w:p>
-          <w:p>
-            <w:pPr>
-              <w:pStyle w:val="Normal"/>
-              <w:widowControl/>
-              <w:suppressAutoHyphens w:val="true"/>
-              <w:spacing w:before="0" w:after="0"/>
-              <w:jc w:val="end"/>
-              <w:rPr>
-                <w:rFonts w:ascii="Arial" w:hAnsi="Arial" w:cs="Arial"/>
-                <w:sz w:val="22"/>
-                <w:szCs w:val="22"/>
-              </w:rPr>
-            </w:pPr>
-            <w:r>
-              <w:rPr>
-                <w:rFonts w:eastAsia="Times New Roman" w:cs="Arial" w:ascii="Arial" w:hAnsi="Arial"/>
-                <w:kern w:val="0"/>
-                <w:sz w:val="15"/>
-                <w:szCs w:val="22"/>
-                <w:lang w:val="pt-BR" w:eastAsia="pt-BR" w:bidi="ar-SA"/>
-              </w:rPr>
-              <w:t>São Paulo, {{dataExt}}.</w:t>
-            </w:r>
-          </w:p>
-          <w:p>
-            <w:pPr>
-              <w:pStyle w:val="Normal"/>
-              <w:widowControl/>
-              <w:suppressAutoHyphens w:val="true"/>
-              <w:spacing w:before="0" w:after="0"/>
-              <w:jc w:val="start"/>
-              <w:rPr>
-                <w:rFonts w:ascii="Arial" w:hAnsi="Arial" w:cs="Arial"/>
-                <w:b/>
-                <w:bCs/>
-              </w:rPr>
-            </w:pPr>
-            <w:r>
-              <w:rPr>
-                <w:rFonts w:cs="Arial" w:ascii="Arial" w:hAnsi="Arial"/>
-                <w:b/>
-                <w:bCs/>
-              </w:rPr>
+              </w:rPr>
+              <w:t>São Paulo, {dataExt}.</w:t>
             </w:r>
           </w:p>
         </w:tc>
       </w:tr>
       <w:tr>
         <w:trPr>
-          <w:trHeight w:val="228" w:hRule="atLeast"/>
+          <w:trHeight w:val="227" w:hRule="atLeast"/>
         </w:trPr>
         <w:tc>
           <w:tcPr>
             <w:tcW w:w="10059" w:type="dxa"/>
             <w:gridSpan w:val="8"/>
             <w:tcBorders/>
+            <w:tcMar>
+              <w:top w:w="40" w:type="dxa"/>
+              <w:start w:w="50" w:type="dxa"/>
+              <w:bottom w:w="40" w:type="dxa"/>
+              <w:end w:w="50" w:type="dxa"/>
+            </w:tcMar>
+            <w:vAlign w:val="center"/>
           </w:tcPr>
           <w:p>
             <w:pPr>
               <w:pStyle w:val="Normal"/>
+              <w:keepNext w:val="0"/>
               <w:widowControl/>
               <w:suppressAutoHyphens w:val="true"/>
-              <w:spacing w:before="0" w:after="0"/>
+              <w:spacing w:before="0" w:after="0" w:line="240" w:lineRule="auto"/>
               <w:jc w:val="center"/>
               <w:rPr>
                 <w:rFonts w:ascii="Arial" w:hAnsi="Arial" w:cs="Arial"/>
@@ -1682,115 +716,58 @@
             </w:pPr>
             <w:r>
               <w:rPr>
-                <w:rFonts w:eastAsia="Times New Roman" w:cs="Arial" w:ascii="Arial" w:hAnsi="Arial"/>
+                <w:rFonts w:ascii="Arial" w:hAnsi="Arial" w:eastAsia="Arial" w:cs="Arial"/>
                 <w:b/>
-                <w:bCs/>
-                <w:kern w:val="0"/>
-                <w:sz w:val="20"/>
-                <w:szCs w:val="20"/>
-                <w:lang w:val="pt-BR" w:eastAsia="pt-BR" w:bidi="ar-SA"/>
-              </w:rPr>
-              <w:t xml:space="preserve">LOCALIZAÇÃO DA EXUMAÇÃO </w:t>
+                <w:sz w:val="18"/>
+              </w:rPr>
+              <w:t>LOCALIZAÇÃO DA EXUMAÇÃO</w:t>
             </w:r>
           </w:p>
         </w:tc>
       </w:tr>
       <w:tr>
         <w:trPr>
-          <w:trHeight w:val="532" w:hRule="atLeast"/>
+          <w:trHeight w:val="624" w:hRule="atLeast"/>
         </w:trPr>
         <w:tc>
           <w:tcPr>
             <w:tcW w:w="2029" w:type="dxa"/>
             <w:tcBorders/>
+            <w:tcMar>
+              <w:top w:w="40" w:type="dxa"/>
+              <w:start w:w="50" w:type="dxa"/>
+              <w:bottom w:w="40" w:type="dxa"/>
+              <w:end w:w="50" w:type="dxa"/>
+            </w:tcMar>
+            <w:vAlign w:val="center"/>
           </w:tcPr>
           <w:p>
             <w:pPr>
-              <w:pStyle w:val="Normal"/>
-              <w:widowControl/>
-              <w:suppressAutoHyphens w:val="true"/>
-              <w:spacing w:before="0" w:after="0"/>
+              <w:keepNext w:val="0"/>
+              <w:spacing w:before="0" w:after="0" w:line="240" w:lineRule="auto"/>
               <w:jc w:val="center"/>
-              <w:rPr>
-                <w:rFonts w:ascii="Arial" w:hAnsi="Arial" w:cs="Arial"/>
-                <w:sz w:val="18"/>
-                <w:szCs w:val="18"/>
-              </w:rPr>
             </w:pPr>
             <w:r>
               <w:rPr>
-                <w:rFonts w:eastAsia="Times New Roman" w:cs="Arial" w:ascii="Arial" w:hAnsi="Arial"/>
-                <w:kern w:val="0"/>
-                <w:sz w:val="18"/>
-                <w:szCs w:val="18"/>
-                <w:lang w:val="pt-BR" w:eastAsia="pt-BR" w:bidi="ar-SA"/>
-              </w:rPr>
-              <w:t>N° quadra:</w:t>
+                <w:rFonts w:ascii="Arial" w:hAnsi="Arial" w:eastAsia="Arial" w:cs="Arial"/>
+                <w:sz w:val="17"/>
+              </w:rPr>
+              <w:t>RUA / QUADRA</w:t>
             </w:r>
           </w:p>
           <w:p>
             <w:pPr>
-              <w:pStyle w:val="Normal"/>
-              <w:widowControl/>
-              <w:suppressAutoHyphens w:val="true"/>
-              <w:spacing w:before="0" w:after="0"/>
-              <w:jc w:val="start"/>
-              <w:rPr>
-                <w:rFonts w:ascii="Arial" w:hAnsi="Arial" w:cs="Arial"/>
+              <w:keepNext w:val="0"/>
+              <w:spacing w:before="0" w:after="0" w:line="240" w:lineRule="auto"/>
+              <w:jc w:val="center"/>
+            </w:pPr>
+            <w:r>
+              <w:rPr>
+                <w:rFonts w:ascii="Arial" w:hAnsi="Arial" w:eastAsia="Arial" w:cs="Arial"/>
                 <w:b/>
-                <w:bCs/>
-                <w:sz w:val="22"/>
-                <w:szCs w:val="22"/>
-              </w:rPr>
-            </w:pPr>
-            <w:r>
-              <w:rPr>
-                <w:rFonts w:eastAsia="Times New Roman" w:cs="Arial" w:ascii="Arial" w:hAnsi="Arial"/>
-                <w:b/>
-                <w:bCs/>
-                <w:kern w:val="0"/>
-                <w:sz w:val="22"/>
-                <w:szCs w:val="22"/>
-                <w:lang w:val="pt-BR" w:eastAsia="pt-BR" w:bidi="ar-SA"/>
-              </w:rPr>
-              <w:t xml:space="preserve">          </w:t>
-            </w:r>
-            <w:r>
-              <w:rPr>
-                <w:rFonts w:eastAsia="Times New Roman" w:cs="Arial" w:ascii="Arial" w:hAnsi="Arial"/>
-                <w:b/>
-                <w:bCs/>
-                <w:kern w:val="0"/>
-                <w:sz w:val="22"/>
-                <w:szCs w:val="22"/>
-                <w:lang w:val="pt-BR" w:eastAsia="pt-BR" w:bidi="ar-SA"/>
-              </w:rPr>
-              <w:t>{{quadraRua}}</w:t>
-            </w:r>
-          </w:p>
-          <w:p>
-            <w:pPr>
-              <w:pStyle w:val="Normal"/>
-              <w:widowControl/>
-              <w:suppressAutoHyphens w:val="true"/>
-              <w:spacing w:before="0" w:after="0"/>
-              <w:jc w:val="center"/>
-              <w:rPr>
-                <w:rFonts w:ascii="Arial" w:hAnsi="Arial" w:cs="Arial"/>
-                <w:b/>
-                <w:bCs/>
-                <w:sz w:val="18"/>
-                <w:szCs w:val="18"/>
-              </w:rPr>
-            </w:pPr>
-            <w:r>
-              <w:rPr>
-                <w:rFonts w:cs="Arial" w:ascii="Arial" w:hAnsi="Arial"/>
-                <w:b/>
-                <w:bCs/>
-                <w:sz w:val="18"/>
-                <w:szCs w:val="18"/>
-              </w:rPr>
+                <w:sz w:val="21"/>
+              </w:rPr>
+              <w:t>{quadraRua}</w:t>
             </w:r>
           </w:p>
         </w:tc>
@@ -1798,57 +775,41 @@
           <w:tcPr>
             <w:tcW w:w="2035" w:type="dxa"/>
             <w:tcBorders/>
+            <w:tcMar>
+              <w:top w:w="40" w:type="dxa"/>
+              <w:start w:w="50" w:type="dxa"/>
+              <w:bottom w:w="40" w:type="dxa"/>
+              <w:end w:w="50" w:type="dxa"/>
+            </w:tcMar>
+            <w:vAlign w:val="center"/>
           </w:tcPr>
           <w:p>
             <w:pPr>
-              <w:pStyle w:val="Normal"/>
-              <w:widowControl/>
-              <w:suppressAutoHyphens w:val="true"/>
-              <w:spacing w:before="0" w:after="0"/>
+              <w:keepNext w:val="0"/>
+              <w:spacing w:before="0" w:after="0" w:line="240" w:lineRule="auto"/>
               <w:jc w:val="center"/>
-              <w:rPr>
-                <w:rFonts w:ascii="Arial" w:hAnsi="Arial" w:cs="Arial"/>
-                <w:sz w:val="18"/>
-                <w:szCs w:val="18"/>
-              </w:rPr>
             </w:pPr>
             <w:r>
               <w:rPr>
-                <w:rFonts w:eastAsia="Times New Roman" w:cs="Arial" w:ascii="Arial" w:hAnsi="Arial"/>
-                <w:kern w:val="0"/>
-                <w:sz w:val="18"/>
-                <w:szCs w:val="18"/>
-                <w:lang w:val="pt-BR" w:eastAsia="pt-BR" w:bidi="ar-SA"/>
-              </w:rPr>
-              <w:t>Nº Sepultura:</w:t>
+                <w:rFonts w:ascii="Arial" w:hAnsi="Arial" w:eastAsia="Arial" w:cs="Arial"/>
+                <w:sz w:val="17"/>
+              </w:rPr>
+              <w:t>Nº Sepultura</w:t>
             </w:r>
           </w:p>
           <w:p>
             <w:pPr>
-              <w:pStyle w:val="Normal"/>
-              <w:widowControl/>
-              <w:suppressAutoHyphens w:val="true"/>
-              <w:spacing w:before="0" w:after="0"/>
+              <w:keepNext w:val="0"/>
+              <w:spacing w:before="0" w:after="0" w:line="240" w:lineRule="auto"/>
               <w:jc w:val="center"/>
-              <w:rPr>
-                <w:rFonts w:ascii="Arial" w:hAnsi="Arial" w:cs="Arial"/>
+            </w:pPr>
+            <w:r>
+              <w:rPr>
+                <w:rFonts w:ascii="Arial" w:hAnsi="Arial" w:eastAsia="Arial" w:cs="Arial"/>
                 <w:b/>
-                <w:bCs/>
-                <w:sz w:val="24"/>
-                <w:szCs w:val="24"/>
-              </w:rPr>
-            </w:pPr>
-            <w:r>
-              <w:rPr>
-                <w:rFonts w:eastAsia="Times New Roman" w:cs="Arial" w:ascii="Arial" w:hAnsi="Arial"/>
-                <w:b/>
-                <w:bCs/>
-                <w:kern w:val="0"/>
-                <w:sz w:val="24"/>
-                <w:szCs w:val="24"/>
-                <w:lang w:val="pt-BR" w:eastAsia="pt-BR" w:bidi="ar-SA"/>
-              </w:rPr>
-              <w:t>{{sepultura}}</w:t>
+                <w:sz w:val="21"/>
+              </w:rPr>
+              <w:t>{sepultura}</w:t>
             </w:r>
           </w:p>
         </w:tc>
@@ -1857,90 +818,41 @@
             <w:tcW w:w="1693" w:type="dxa"/>
             <w:gridSpan w:val="2"/>
             <w:tcBorders/>
+            <w:tcMar>
+              <w:top w:w="40" w:type="dxa"/>
+              <w:start w:w="50" w:type="dxa"/>
+              <w:bottom w:w="40" w:type="dxa"/>
+              <w:end w:w="50" w:type="dxa"/>
+            </w:tcMar>
+            <w:vAlign w:val="center"/>
           </w:tcPr>
           <w:p>
             <w:pPr>
-              <w:pStyle w:val="Normal"/>
-              <w:widowControl/>
-              <w:suppressAutoHyphens w:val="true"/>
-              <w:spacing w:before="0" w:after="0"/>
+              <w:keepNext w:val="0"/>
+              <w:spacing w:before="0" w:after="0" w:line="240" w:lineRule="auto"/>
               <w:jc w:val="center"/>
-              <w:rPr>
-                <w:rFonts w:ascii="Arial" w:hAnsi="Arial" w:cs="Arial"/>
-                <w:sz w:val="18"/>
-                <w:szCs w:val="18"/>
-              </w:rPr>
             </w:pPr>
             <w:r>
               <w:rPr>
-                <w:rFonts w:eastAsia="Times New Roman" w:cs="Arial" w:ascii="Arial" w:hAnsi="Arial"/>
-                <w:kern w:val="0"/>
-                <w:sz w:val="18"/>
-                <w:szCs w:val="18"/>
-                <w:lang w:val="pt-BR" w:eastAsia="pt-BR" w:bidi="ar-SA"/>
+                <w:rFonts w:ascii="Arial" w:hAnsi="Arial" w:eastAsia="Arial" w:cs="Arial"/>
+                <w:sz w:val="17"/>
               </w:rPr>
               <w:t>Nº gaveta</w:t>
             </w:r>
           </w:p>
           <w:p>
             <w:pPr>
-              <w:pStyle w:val="Normal"/>
-              <w:widowControl/>
-              <w:suppressAutoHyphens w:val="true"/>
-              <w:spacing w:before="0" w:after="0"/>
+              <w:keepNext w:val="0"/>
+              <w:spacing w:before="0" w:after="0" w:line="240" w:lineRule="auto"/>
               <w:jc w:val="center"/>
-              <w:rPr>
-                <w:rFonts w:ascii="Arial" w:hAnsi="Arial" w:cs="Arial"/>
-                <w:sz w:val="2"/>
-                <w:szCs w:val="2"/>
-              </w:rPr>
             </w:pPr>
             <w:r>
               <w:rPr>
-                <w:rFonts w:cs="Arial" w:ascii="Arial" w:hAnsi="Arial"/>
-                <w:sz w:val="2"/>
-                <w:szCs w:val="2"/>
-              </w:rPr>
-            </w:r>
-          </w:p>
-          <w:p>
-            <w:pPr>
-              <w:pStyle w:val="Normal"/>
-              <w:widowControl/>
-              <w:suppressAutoHyphens w:val="true"/>
-              <w:spacing w:before="0" w:after="0"/>
-              <w:jc w:val="start"/>
-              <w:rPr>
-                <w:rFonts w:ascii="Arial" w:hAnsi="Arial" w:cs="Arial"/>
+                <w:rFonts w:ascii="Arial" w:hAnsi="Arial" w:eastAsia="Arial" w:cs="Arial"/>
                 <w:b/>
-                <w:bCs/>
-                <w:sz w:val="22"/>
-                <w:szCs w:val="22"/>
-              </w:rPr>
-            </w:pPr>
-            <w:r>
-              <w:rPr>
-                <w:rFonts w:eastAsia="Times New Roman" w:cs="Arial" w:ascii="Arial" w:hAnsi="Arial"/>
-                <w:b/>
-                <w:bCs/>
-                <w:kern w:val="0"/>
-                <w:sz w:val="22"/>
-                <w:szCs w:val="22"/>
-                <w:lang w:val="pt-BR" w:eastAsia="pt-BR" w:bidi="ar-SA"/>
-              </w:rPr>
-              <w:t xml:space="preserve">     </w:t>
-            </w:r>
-            <w:r>
-              <w:rPr>
-                <w:rFonts w:eastAsia="Times New Roman" w:cs="Arial" w:ascii="Arial" w:hAnsi="Arial"/>
-                <w:b/>
-                <w:bCs/>
-                <w:kern w:val="0"/>
-                <w:sz w:val="22"/>
-                <w:szCs w:val="22"/>
-                <w:lang w:val="pt-BR" w:eastAsia="pt-BR" w:bidi="ar-SA"/>
-              </w:rPr>
-              <w:t>{{gaveta}}</w:t>
+                <w:sz w:val="21"/>
+              </w:rPr>
+              <w:t>{gaveta}</w:t>
             </w:r>
           </w:p>
         </w:tc>
@@ -1949,170 +861,241 @@
             <w:tcW w:w="4302" w:type="dxa"/>
             <w:gridSpan w:val="4"/>
             <w:tcBorders/>
+            <w:tcMar>
+              <w:top w:w="40" w:type="dxa"/>
+              <w:start w:w="50" w:type="dxa"/>
+              <w:bottom w:w="40" w:type="dxa"/>
+              <w:end w:w="50" w:type="dxa"/>
+            </w:tcMar>
+            <w:vAlign w:val="center"/>
           </w:tcPr>
           <w:p>
             <w:pPr>
-              <w:pStyle w:val="Normal"/>
-              <w:widowControl/>
-              <w:suppressAutoHyphens w:val="true"/>
-              <w:spacing w:before="0" w:after="0"/>
-              <w:jc w:val="start"/>
-              <w:rPr>
-                <w:rFonts w:ascii="Arial" w:hAnsi="Arial" w:cs="Arial"/>
-                <w:sz w:val="18"/>
-                <w:szCs w:val="18"/>
-              </w:rPr>
+              <w:spacing w:before="0" w:after="0" w:line="240" w:lineRule="auto"/>
             </w:pPr>
-            <w:r>
-              <w:rPr>
-                <w:rFonts w:eastAsia="Times New Roman" w:cs="Arial" w:ascii="Arial" w:hAnsi="Arial"/>
-                <w:kern w:val="0"/>
-                <w:sz w:val="18"/>
-                <w:szCs w:val="18"/>
-                <w:lang w:val="pt-BR" w:eastAsia="pt-BR" w:bidi="ar-SA"/>
-              </w:rPr>
-              <w:t>Óbito:                                    Concessão:</w:t>
-            </w:r>
           </w:p>
+          <w:tbl>
+            <w:tblPr>
+              <w:tblW w:type="auto" w:w="0"/>
+              <w:tblLayout w:type="fixed"/>
+              <w:tblLook w:firstColumn="1" w:firstRow="1" w:lastColumn="0" w:lastRow="0" w:noHBand="0" w:noVBand="1" w:val="04A0"/>
+            </w:tblPr>
+            <w:tblGrid>
+              <w:gridCol w:w="2151"/>
+              <w:gridCol w:w="2151"/>
+            </w:tblGrid>
+            <w:tr>
+              <w:tc>
+                <w:tcPr>
+                  <w:tcW w:type="dxa" w:w="2151"/>
+                  <w:tcBorders>
+                    <w:top w:val="nil"/>
+                    <w:left w:val="nil"/>
+                    <w:bottom w:val="nil"/>
+                    <w:right w:val="nil"/>
+                    <w:insideH w:val="nil"/>
+                    <w:insideV w:val="nil"/>
+                  </w:tcBorders>
+                </w:tcPr>
+                <w:p>
+                  <w:pPr>
+                    <w:keepNext w:val="0"/>
+                    <w:spacing w:before="0" w:after="0" w:line="240" w:lineRule="auto"/>
+                    <w:jc w:val="left"/>
+                  </w:pPr>
+                  <w:r>
+                    <w:rPr>
+                      <w:rFonts w:ascii="Arial" w:hAnsi="Arial" w:eastAsia="Arial" w:cs="Arial"/>
+                      <w:b/>
+                      <w:i w:val="0"/>
+                      <w:sz w:val="17"/>
+                    </w:rPr>
+                    <w:t>ÓBITO</w:t>
+                  </w:r>
+                </w:p>
+              </w:tc>
+              <w:tc>
+                <w:tcPr>
+                  <w:tcW w:type="dxa" w:w="2151"/>
+                  <w:tcBorders>
+                    <w:top w:val="nil"/>
+                    <w:left w:val="nil"/>
+                    <w:bottom w:val="nil"/>
+                    <w:right w:val="nil"/>
+                    <w:insideH w:val="nil"/>
+                    <w:insideV w:val="nil"/>
+                  </w:tcBorders>
+                </w:tcPr>
+                <w:p>
+                  <w:pPr>
+                    <w:keepNext w:val="0"/>
+                    <w:spacing w:before="0" w:after="0" w:line="240" w:lineRule="auto"/>
+                    <w:jc w:val="left"/>
+                  </w:pPr>
+                  <w:r>
+                    <w:rPr>
+                      <w:rFonts w:ascii="Arial" w:hAnsi="Arial" w:eastAsia="Arial" w:cs="Arial"/>
+                      <w:b/>
+                      <w:i w:val="0"/>
+                      <w:sz w:val="17"/>
+                    </w:rPr>
+                    <w:t>CONCESSÃO</w:t>
+                  </w:r>
+                </w:p>
+              </w:tc>
+            </w:tr>
+            <w:tr>
+              <w:tc>
+                <w:tcPr>
+                  <w:tcW w:type="dxa" w:w="2151"/>
+                  <w:tcBorders>
+                    <w:top w:val="nil"/>
+                    <w:left w:val="nil"/>
+                    <w:bottom w:val="nil"/>
+                    <w:right w:val="nil"/>
+                    <w:insideH w:val="nil"/>
+                    <w:insideV w:val="nil"/>
+                  </w:tcBorders>
+                </w:tcPr>
+                <w:p>
+                  <w:pPr>
+                    <w:keepNext w:val="0"/>
+                    <w:spacing w:before="0" w:after="0" w:line="240" w:lineRule="auto"/>
+                    <w:jc w:val="left"/>
+                  </w:pPr>
+                  <w:r>
+                    <w:rPr>
+                      <w:rFonts w:ascii="Arial" w:hAnsi="Arial" w:eastAsia="Arial" w:cs="Arial"/>
+                      <w:b/>
+                      <w:i w:val="0"/>
+                      <w:sz w:val="17"/>
+                    </w:rPr>
+                    <w:t xml:space="preserve">LIVRO: </w:t>
+                  </w:r>
+                </w:p>
+              </w:tc>
+              <w:tc>
+                <w:tcPr>
+                  <w:tcW w:type="dxa" w:w="2151"/>
+                  <w:tcBorders>
+                    <w:top w:val="nil"/>
+                    <w:left w:val="nil"/>
+                    <w:bottom w:val="nil"/>
+                    <w:right w:val="nil"/>
+                    <w:insideH w:val="nil"/>
+                    <w:insideV w:val="nil"/>
+                  </w:tcBorders>
+                </w:tcPr>
+                <w:p>
+                  <w:pPr>
+                    <w:keepNext w:val="0"/>
+                    <w:spacing w:before="0" w:after="0" w:line="240" w:lineRule="auto"/>
+                    <w:jc w:val="left"/>
+                  </w:pPr>
+                  <w:r>
+                    <w:rPr>
+                      <w:rFonts w:ascii="Arial" w:hAnsi="Arial" w:eastAsia="Arial" w:cs="Arial"/>
+                      <w:b/>
+                      <w:i w:val="0"/>
+                      <w:sz w:val="17"/>
+                    </w:rPr>
+                    <w:t xml:space="preserve">LIVRO: </w:t>
+                  </w:r>
+                </w:p>
+              </w:tc>
+            </w:tr>
+            <w:tr>
+              <w:tc>
+                <w:tcPr>
+                  <w:tcW w:type="dxa" w:w="2151"/>
+                  <w:tcBorders>
+                    <w:top w:val="nil"/>
+                    <w:left w:val="nil"/>
+                    <w:bottom w:val="nil"/>
+                    <w:right w:val="nil"/>
+                    <w:insideH w:val="nil"/>
+                    <w:insideV w:val="nil"/>
+                  </w:tcBorders>
+                </w:tcPr>
+                <w:p>
+                  <w:pPr>
+                    <w:keepNext w:val="0"/>
+                    <w:spacing w:before="0" w:after="0" w:line="240" w:lineRule="auto"/>
+                    <w:jc w:val="left"/>
+                  </w:pPr>
+                  <w:r>
+                    <w:rPr>
+                      <w:rFonts w:ascii="Arial" w:hAnsi="Arial" w:eastAsia="Arial" w:cs="Arial"/>
+                      <w:b/>
+                      <w:i w:val="0"/>
+                      <w:sz w:val="17"/>
+                    </w:rPr>
+                    <w:t xml:space="preserve">FOLHA: </w:t>
+                  </w:r>
+                </w:p>
+              </w:tc>
+              <w:tc>
+                <w:tcPr>
+                  <w:tcW w:type="dxa" w:w="2151"/>
+                  <w:tcBorders>
+                    <w:top w:val="nil"/>
+                    <w:left w:val="nil"/>
+                    <w:bottom w:val="nil"/>
+                    <w:right w:val="nil"/>
+                    <w:insideH w:val="nil"/>
+                    <w:insideV w:val="nil"/>
+                  </w:tcBorders>
+                </w:tcPr>
+                <w:p>
+                  <w:pPr>
+                    <w:keepNext w:val="0"/>
+                    <w:spacing w:before="0" w:after="0" w:line="240" w:lineRule="auto"/>
+                    <w:jc w:val="left"/>
+                  </w:pPr>
+                  <w:r>
+                    <w:rPr>
+                      <w:rFonts w:ascii="Arial" w:hAnsi="Arial" w:eastAsia="Arial" w:cs="Arial"/>
+                      <w:b/>
+                      <w:i w:val="0"/>
+                      <w:sz w:val="17"/>
+                    </w:rPr>
+                    <w:t xml:space="preserve">FOLHA: </w:t>
+                  </w:r>
+                </w:p>
+              </w:tc>
+            </w:tr>
+          </w:tbl>
           <w:p>
             <w:pPr>
-              <w:pStyle w:val="Normal"/>
-              <w:widowControl/>
-              <w:suppressAutoHyphens w:val="true"/>
-              <w:spacing w:before="0" w:after="0"/>
-              <w:jc w:val="start"/>
-              <w:rPr>
-                <w:rFonts w:ascii="Arial" w:hAnsi="Arial" w:cs="Arial"/>
-                <w:b/>
-                <w:bCs/>
-                <w:u w:val="single"/>
-              </w:rPr>
+              <w:spacing w:before="0" w:after="0" w:line="240" w:lineRule="auto"/>
             </w:pPr>
-            <w:r>
-              <w:rPr>
-                <w:rFonts w:eastAsia="Times New Roman" w:cs="Arial" w:ascii="Arial" w:hAnsi="Arial"/>
-                <w:kern w:val="0"/>
-                <w:sz w:val="18"/>
-                <w:szCs w:val="18"/>
-                <w:lang w:val="pt-BR" w:eastAsia="pt-BR" w:bidi="ar-SA"/>
-              </w:rPr>
-              <w:t>LIVRO:</w:t>
-            </w:r>
-            <w:r>
-              <w:rPr>
-                <w:rFonts w:eastAsia="Times New Roman" w:cs="Arial" w:ascii="Arial" w:hAnsi="Arial"/>
-                <w:kern w:val="0"/>
-                <w:sz w:val="20"/>
-                <w:szCs w:val="20"/>
-                <w:lang w:val="pt-BR" w:eastAsia="pt-BR" w:bidi="ar-SA"/>
-              </w:rPr>
-              <w:t xml:space="preserve">                           </w:t>
-            </w:r>
-            <w:r>
-              <w:rPr>
-                <w:rFonts w:eastAsia="Times New Roman" w:cs="Arial" w:ascii="Arial" w:hAnsi="Arial"/>
-                <w:bCs/>
-                <w:kern w:val="0"/>
-                <w:sz w:val="20"/>
-                <w:szCs w:val="20"/>
-                <w:lang w:val="pt-BR" w:eastAsia="pt-BR" w:bidi="ar-SA"/>
-              </w:rPr>
-              <w:t>LIVRO:</w:t>
-            </w:r>
-          </w:p>
-          <w:p>
-            <w:pPr>
-              <w:pStyle w:val="Normal"/>
-              <w:widowControl/>
-              <w:suppressAutoHyphens w:val="true"/>
-              <w:spacing w:before="0" w:after="0"/>
-              <w:jc w:val="start"/>
-              <w:rPr>
-                <w:rFonts w:ascii="Arial" w:hAnsi="Arial" w:cs="Arial"/>
-                <w:sz w:val="18"/>
-                <w:szCs w:val="18"/>
-                <w:u w:val="single"/>
-              </w:rPr>
-            </w:pPr>
-            <w:r>
-              <w:rPr>
-                <w:rFonts w:eastAsia="Times New Roman" w:cs="Arial" w:ascii="Arial" w:hAnsi="Arial"/>
-                <w:kern w:val="0"/>
-                <w:sz w:val="18"/>
-                <w:szCs w:val="18"/>
-                <w:lang w:val="pt-BR" w:eastAsia="pt-BR" w:bidi="ar-SA"/>
-              </w:rPr>
-              <w:t>FOLHA:</w:t>
-            </w:r>
-            <w:r>
-              <w:rPr>
-                <w:rFonts w:eastAsia="Times New Roman" w:cs="Arial" w:ascii="Arial" w:hAnsi="Arial"/>
-                <w:kern w:val="0"/>
-                <w:sz w:val="20"/>
-                <w:szCs w:val="20"/>
-                <w:lang w:val="pt-BR" w:eastAsia="pt-BR" w:bidi="ar-SA"/>
-              </w:rPr>
-              <w:t xml:space="preserve">                           FOLHA</w:t>
-            </w:r>
-            <w:r>
-              <w:rPr>
-                <w:rFonts w:eastAsia="Times New Roman" w:cs="Arial" w:ascii="Arial" w:hAnsi="Arial"/>
-                <w:b/>
-                <w:bCs/>
-                <w:kern w:val="0"/>
-                <w:sz w:val="20"/>
-                <w:szCs w:val="20"/>
-                <w:lang w:val="pt-BR" w:eastAsia="pt-BR" w:bidi="ar-SA"/>
-              </w:rPr>
-              <w:t>:</w:t>
-            </w:r>
-          </w:p>
-          <w:p>
-            <w:pPr>
-              <w:pStyle w:val="Normal"/>
-              <w:widowControl/>
-              <w:suppressAutoHyphens w:val="true"/>
-              <w:spacing w:before="0" w:after="0"/>
-              <w:jc w:val="center"/>
-              <w:rPr>
-                <w:rFonts w:ascii="Arial" w:hAnsi="Arial" w:cs="Arial"/>
-                <w:b/>
-                <w:bCs/>
-                <w:sz w:val="2"/>
-                <w:szCs w:val="2"/>
-              </w:rPr>
-            </w:pPr>
-            <w:r>
-              <w:rPr>
-                <w:rFonts w:eastAsia="Times New Roman" w:cs="Arial" w:ascii="Arial" w:hAnsi="Arial"/>
-                <w:b/>
-                <w:bCs/>
-                <w:kern w:val="0"/>
-                <w:sz w:val="2"/>
-                <w:szCs w:val="2"/>
-                <w:lang w:val="pt-BR" w:eastAsia="pt-BR" w:bidi="ar-SA"/>
-              </w:rPr>
-              <w:t xml:space="preserve"> </w:t>
-            </w:r>
           </w:p>
         </w:tc>
       </w:tr>
       <w:tr>
         <w:trPr>
-          <w:trHeight w:val="228" w:hRule="atLeast"/>
+          <w:trHeight w:val="227" w:hRule="atLeast"/>
         </w:trPr>
         <w:tc>
           <w:tcPr>
             <w:tcW w:w="10059" w:type="dxa"/>
             <w:gridSpan w:val="8"/>
             <w:tcBorders/>
+            <w:tcMar>
+              <w:top w:w="40" w:type="dxa"/>
+              <w:start w:w="50" w:type="dxa"/>
+              <w:bottom w:w="40" w:type="dxa"/>
+              <w:end w:w="50" w:type="dxa"/>
+            </w:tcMar>
+            <w:vAlign w:val="center"/>
           </w:tcPr>
           <w:p>
             <w:pPr>
               <w:pStyle w:val="Normal"/>
+              <w:keepNext w:val="0"/>
               <w:widowControl/>
               <w:suppressAutoHyphens w:val="true"/>
-              <w:spacing w:before="0" w:after="0"/>
+              <w:spacing w:before="0" w:after="0" w:line="240" w:lineRule="auto"/>
               <w:jc w:val="center"/>
               <w:rPr>
                 <w:rFonts w:ascii="Arial" w:hAnsi="Arial" w:cs="Arial"/>
@@ -2122,13 +1105,9 @@
             </w:pPr>
             <w:r>
               <w:rPr>
-                <w:rFonts w:eastAsia="Times New Roman" w:cs="Arial" w:ascii="Arial" w:hAnsi="Arial"/>
+                <w:rFonts w:ascii="Arial" w:hAnsi="Arial" w:eastAsia="Arial" w:cs="Arial"/>
                 <w:b/>
-                <w:bCs/>
-                <w:kern w:val="0"/>
-                <w:sz w:val="20"/>
-                <w:szCs w:val="20"/>
-                <w:lang w:val="pt-BR" w:eastAsia="pt-BR" w:bidi="ar-SA"/>
+                <w:sz w:val="18"/>
               </w:rPr>
               <w:t>EXUMAÇÃO</w:t>
             </w:r>
@@ -2137,151 +1116,92 @@
       </w:tr>
       <w:tr>
         <w:trPr>
-          <w:trHeight w:val="461" w:hRule="atLeast"/>
+          <w:trHeight w:val="312" w:hRule="atLeast"/>
         </w:trPr>
         <w:tc>
           <w:tcPr>
             <w:tcW w:w="10059" w:type="dxa"/>
             <w:gridSpan w:val="8"/>
             <w:tcBorders/>
+            <w:tcMar>
+              <w:top w:w="40" w:type="dxa"/>
+              <w:start w:w="50" w:type="dxa"/>
+              <w:bottom w:w="40" w:type="dxa"/>
+              <w:end w:w="50" w:type="dxa"/>
+            </w:tcMar>
+            <w:vAlign w:val="center"/>
           </w:tcPr>
           <w:p>
             <w:pPr>
-              <w:pStyle w:val="Normal"/>
-              <w:widowControl/>
-              <w:suppressAutoHyphens w:val="true"/>
-              <w:spacing w:before="0" w:after="0"/>
-              <w:jc w:val="start"/>
-              <w:rPr>
-                <w:rFonts w:ascii="Arial" w:hAnsi="Arial" w:cs="Arial"/>
-                <w:sz w:val="18"/>
-                <w:szCs w:val="18"/>
-              </w:rPr>
+              <w:keepNext w:val="0"/>
+              <w:spacing w:before="0" w:after="0" w:line="240" w:lineRule="auto"/>
             </w:pPr>
             <w:r>
               <w:rPr>
-                <w:rFonts w:eastAsia="Times New Roman" w:cs="Arial" w:ascii="Arial" w:hAnsi="Arial"/>
-                <w:kern w:val="0"/>
-                <w:sz w:val="18"/>
-                <w:szCs w:val="18"/>
-                <w:lang w:val="pt-BR" w:eastAsia="pt-BR" w:bidi="ar-SA"/>
+                <w:rFonts w:ascii="Arial" w:hAnsi="Arial" w:eastAsia="Arial" w:cs="Arial"/>
+                <w:sz w:val="17"/>
               </w:rPr>
               <w:t>Responsável pela Exumação:</w:t>
-            </w:r>
-          </w:p>
-          <w:p>
-            <w:pPr>
-              <w:pStyle w:val="Normal"/>
-              <w:widowControl/>
-              <w:suppressAutoHyphens w:val="true"/>
-              <w:spacing w:before="0" w:after="0"/>
-              <w:jc w:val="start"/>
-              <w:rPr>
-                <w:rFonts w:ascii="Arial" w:hAnsi="Arial" w:cs="Arial"/>
-                <w:sz w:val="18"/>
-                <w:szCs w:val="18"/>
-              </w:rPr>
-            </w:pPr>
-            <w:r>
-              <w:rPr>
-                <w:rFonts w:cs="Arial" w:ascii="Arial" w:hAnsi="Arial"/>
-                <w:sz w:val="18"/>
-                <w:szCs w:val="18"/>
-              </w:rPr>
             </w:r>
           </w:p>
         </w:tc>
       </w:tr>
       <w:tr>
         <w:trPr>
-          <w:trHeight w:val="643" w:hRule="atLeast"/>
+          <w:trHeight w:val="425" w:hRule="atLeast"/>
         </w:trPr>
         <w:tc>
           <w:tcPr>
             <w:tcW w:w="10059" w:type="dxa"/>
             <w:gridSpan w:val="8"/>
             <w:tcBorders/>
+            <w:tcMar>
+              <w:top w:w="40" w:type="dxa"/>
+              <w:start w:w="50" w:type="dxa"/>
+              <w:bottom w:w="40" w:type="dxa"/>
+              <w:end w:w="50" w:type="dxa"/>
+            </w:tcMar>
+            <w:vAlign w:val="center"/>
           </w:tcPr>
           <w:p>
             <w:pPr>
-              <w:pStyle w:val="Normal"/>
-              <w:widowControl/>
-              <w:suppressAutoHyphens w:val="true"/>
-              <w:spacing w:before="0" w:after="0"/>
-              <w:jc w:val="center"/>
-              <w:rPr>
-                <w:rFonts w:ascii="Arial" w:hAnsi="Arial" w:cs="Arial"/>
-                <w:sz w:val="18"/>
-                <w:szCs w:val="18"/>
-              </w:rPr>
+              <w:keepNext w:val="0"/>
+              <w:spacing w:before="0" w:after="0" w:line="240" w:lineRule="auto"/>
             </w:pPr>
             <w:r>
               <w:rPr>
-                <w:rFonts w:cs="Arial" w:ascii="Arial" w:hAnsi="Arial"/>
-                <w:sz w:val="18"/>
-                <w:szCs w:val="18"/>
-              </w:rPr>
-            </w:r>
-          </w:p>
-          <w:p>
-            <w:pPr>
-              <w:pStyle w:val="Normal"/>
-              <w:widowControl/>
-              <w:suppressAutoHyphens w:val="true"/>
-              <w:spacing w:before="0" w:after="0"/>
-              <w:jc w:val="start"/>
-              <w:rPr>
-                <w:rFonts w:ascii="Arial" w:hAnsi="Arial" w:cs="Arial"/>
-                <w:sz w:val="18"/>
-                <w:szCs w:val="18"/>
-              </w:rPr>
-            </w:pPr>
-            <w:r>
-              <w:rPr>
-                <w:rFonts w:eastAsia="Times New Roman" w:cs="Arial" w:ascii="Arial" w:hAnsi="Arial"/>
-                <w:kern w:val="0"/>
-                <w:sz w:val="18"/>
-                <w:szCs w:val="18"/>
-                <w:lang w:val="pt-BR" w:eastAsia="pt-BR" w:bidi="ar-SA"/>
-              </w:rPr>
-              <w:t>Supervisor (resp.):____________________    Matrícula:________________ Data da Exumação: _____/_____/_________</w:t>
-            </w:r>
-          </w:p>
-          <w:p>
-            <w:pPr>
-              <w:pStyle w:val="Normal"/>
-              <w:widowControl/>
-              <w:suppressAutoHyphens w:val="true"/>
-              <w:spacing w:before="0" w:after="0"/>
-              <w:jc w:val="center"/>
-              <w:rPr>
-                <w:rFonts w:ascii="Arial" w:hAnsi="Arial" w:cs="Arial"/>
-              </w:rPr>
-            </w:pPr>
-            <w:r>
-              <w:rPr>
-                <w:rFonts w:cs="Arial" w:ascii="Arial" w:hAnsi="Arial"/>
-              </w:rPr>
+                <w:rFonts w:ascii="Arial" w:hAnsi="Arial" w:eastAsia="Arial" w:cs="Arial"/>
+                <w:sz w:val="17"/>
+              </w:rPr>
+              <w:t>Supervisor (resp.): ____________________    Matrícula: ________________    Data da Exumação: ____/____/______</w:t>
             </w:r>
           </w:p>
         </w:tc>
       </w:tr>
       <w:tr>
         <w:trPr>
-          <w:trHeight w:val="228" w:hRule="atLeast"/>
+          <w:trHeight w:val="227" w:hRule="atLeast"/>
         </w:trPr>
         <w:tc>
           <w:tcPr>
             <w:tcW w:w="10059" w:type="dxa"/>
             <w:gridSpan w:val="8"/>
             <w:tcBorders/>
+            <w:tcMar>
+              <w:top w:w="40" w:type="dxa"/>
+              <w:start w:w="50" w:type="dxa"/>
+              <w:bottom w:w="40" w:type="dxa"/>
+              <w:end w:w="50" w:type="dxa"/>
+            </w:tcMar>
+            <w:vAlign w:val="center"/>
           </w:tcPr>
           <w:p>
             <w:pPr>
               <w:pStyle w:val="Normal"/>
+              <w:keepNext w:val="0"/>
               <w:widowControl/>
               <w:suppressAutoHyphens w:val="true"/>
-              <w:spacing w:before="0" w:after="0"/>
+              <w:spacing w:before="0" w:after="0" w:line="240" w:lineRule="auto"/>
               <w:jc w:val="center"/>
               <w:rPr>
                 <w:rFonts w:ascii="Arial" w:hAnsi="Arial" w:cs="Arial"/>
@@ -2291,543 +1211,18 @@
             </w:pPr>
             <w:r>
               <w:rPr>
-                <w:rFonts w:eastAsia="Times New Roman" w:cs="Arial" w:ascii="Arial" w:hAnsi="Arial"/>
+                <w:rFonts w:ascii="Arial" w:hAnsi="Arial" w:eastAsia="Arial" w:cs="Arial"/>
                 <w:b/>
-                <w:bCs/>
-                <w:kern w:val="0"/>
-                <w:sz w:val="20"/>
-                <w:szCs w:val="20"/>
-                <w:lang w:val="pt-BR" w:eastAsia="pt-BR" w:bidi="ar-SA"/>
-              </w:rPr>
-              <w:t>DESTINO DO DESPOJOS</w:t>
+                <w:sz w:val="18"/>
+              </w:rPr>
+              <w:t>DESTINO DOS DESPOJOS</w:t>
             </w:r>
           </w:p>
         </w:tc>
       </w:tr>
       <w:tr>
         <w:trPr>
-          <w:trHeight w:val="1591" w:hRule="atLeast"/>
-        </w:trPr>
-        <w:tc>
-          <w:tcPr>
-            <w:tcW w:w="10059" w:type="dxa"/>
-            <w:gridSpan w:val="8"/>
-            <w:tcBorders/>
-          </w:tcPr>
-          <w:p>
-            <w:pPr>
-              <w:pStyle w:val="Normal"/>
-              <w:widowControl/>
-              <w:suppressAutoHyphens w:val="true"/>
-              <w:spacing w:before="0" w:after="0"/>
-              <w:jc w:val="center"/>
-              <w:rPr>
-                <w:rFonts w:ascii="Arial" w:hAnsi="Arial" w:cs="Arial"/>
-                <w:b/>
-                <w:bCs/>
-                <w:sz w:val="18"/>
-                <w:szCs w:val="18"/>
-              </w:rPr>
-            </w:pPr>
-            <w:r>
-              <w:rPr>
-                <w:rFonts w:cs="Arial" w:ascii="Arial" w:hAnsi="Arial"/>
-                <w:b/>
-                <w:bCs/>
-                <w:sz w:val="18"/>
-                <w:szCs w:val="18"/>
-              </w:rPr>
-              <mc:AlternateContent>
-                <mc:Choice Requires="wps">
-                  <w:drawing>
-                    <wp:anchor behindDoc="0" distT="12700" distB="12700" distL="12700" distR="12700" simplePos="0" locked="0" layoutInCell="1" allowOverlap="1" relativeHeight="14" wp14:anchorId="03F155F8">
-                      <wp:simplePos x="0" y="0"/>
-                      <wp:positionH relativeFrom="column">
-                        <wp:posOffset>3391535</wp:posOffset>
-                      </wp:positionH>
-                      <wp:positionV relativeFrom="paragraph">
-                        <wp:posOffset>135255</wp:posOffset>
-                      </wp:positionV>
-                      <wp:extent cx="152400" cy="129540"/>
-                      <wp:effectExtent l="12700" t="12700" r="12700" b="12700"/>
-                      <wp:wrapNone/>
-                      <wp:docPr id="9" name="Retângulo 1"/>
-                      <a:graphic xmlns:a="http://schemas.openxmlformats.org/drawingml/2006/main">
-                        <a:graphicData uri="http://schemas.microsoft.com/office/word/2010/wordprocessingShape">
-                          <wps:wsp>
-                            <wps:cNvSpPr/>
-                            <wps:spPr>
-                              <a:xfrm>
-                                <a:off x="0" y="0"/>
-                                <a:ext cx="152280" cy="129600"/>
-                              </a:xfrm>
-                              <a:prstGeom prst="rect">
-                                <a:avLst/>
-                              </a:prstGeom>
-                              <a:solidFill>
-                                <a:srgbClr val="ffffff"/>
-                              </a:solidFill>
-                              <a:ln>
-                                <a:solidFill>
-                                  <a:srgbClr val="4f81bd"/>
-                                </a:solidFill>
-                                <a:round/>
-                              </a:ln>
-                            </wps:spPr>
-                            <wps:style>
-                              <a:lnRef idx="2">
-                                <a:schemeClr val="accent1"/>
-                              </a:lnRef>
-                              <a:fillRef idx="1">
-                                <a:schemeClr val="lt1"/>
-                              </a:fillRef>
-                              <a:effectRef idx="0">
-                                <a:schemeClr val="accent1"/>
-                              </a:effectRef>
-                              <a:fontRef idx="minor"/>
-                            </wps:style>
-                            <wps:bodyPr/>
-                          </wps:wsp>
-                        </a:graphicData>
-                      </a:graphic>
-                    </wp:anchor>
-                  </w:drawing>
-                </mc:Choice>
-                <mc:Fallback>
-                  <w:pict>
-                    <v:rect id="shape_0" ID="Retângulo 1" path="m0,0l-2147483645,0l-2147483645,-2147483646l0,-2147483646xe" fillcolor="white" stroked="t" o:allowincell="f" style="position:absolute;margin-left:267.05pt;margin-top:10.65pt;width:11.95pt;height:10.15pt;mso-wrap-style:none;v-text-anchor:middle" wp14:anchorId="03F155F8">
-                      <v:fill o:detectmouseclick="t" type="solid" color2="black"/>
-                      <v:stroke color="#4f81bd" weight="25560" joinstyle="round" endcap="flat"/>
-                      <w10:wrap type="none"/>
-                    </v:rect>
-                  </w:pict>
-                </mc:Fallback>
-              </mc:AlternateContent>
-              <mc:AlternateContent>
-                <mc:Choice Requires="wps">
-                  <w:drawing>
-                    <wp:anchor behindDoc="0" distT="12700" distB="12700" distL="12700" distR="12700" simplePos="0" locked="0" layoutInCell="1" allowOverlap="1" relativeHeight="15" wp14:anchorId="7A04F90E">
-                      <wp:simplePos x="0" y="0"/>
-                      <wp:positionH relativeFrom="column">
-                        <wp:posOffset>78105</wp:posOffset>
-                      </wp:positionH>
-                      <wp:positionV relativeFrom="paragraph">
-                        <wp:posOffset>132080</wp:posOffset>
-                      </wp:positionV>
-                      <wp:extent cx="152400" cy="129540"/>
-                      <wp:effectExtent l="12700" t="12700" r="12700" b="12700"/>
-                      <wp:wrapNone/>
-                      <wp:docPr id="10" name="Retângulo 1"/>
-                      <a:graphic xmlns:a="http://schemas.openxmlformats.org/drawingml/2006/main">
-                        <a:graphicData uri="http://schemas.microsoft.com/office/word/2010/wordprocessingShape">
-                          <wps:wsp>
-                            <wps:cNvSpPr/>
-                            <wps:spPr>
-                              <a:xfrm>
-                                <a:off x="0" y="0"/>
-                                <a:ext cx="152280" cy="129600"/>
-                              </a:xfrm>
-                              <a:prstGeom prst="rect">
-                                <a:avLst/>
-                              </a:prstGeom>
-                              <a:solidFill>
-                                <a:srgbClr val="ffffff"/>
-                              </a:solidFill>
-                              <a:ln>
-                                <a:solidFill>
-                                  <a:srgbClr val="4f81bd"/>
-                                </a:solidFill>
-                                <a:round/>
-                              </a:ln>
-                            </wps:spPr>
-                            <wps:style>
-                              <a:lnRef idx="2">
-                                <a:schemeClr val="accent1"/>
-                              </a:lnRef>
-                              <a:fillRef idx="1">
-                                <a:schemeClr val="lt1"/>
-                              </a:fillRef>
-                              <a:effectRef idx="0">
-                                <a:schemeClr val="accent1"/>
-                              </a:effectRef>
-                              <a:fontRef idx="minor"/>
-                            </wps:style>
-                            <wps:bodyPr/>
-                          </wps:wsp>
-                        </a:graphicData>
-                      </a:graphic>
-                    </wp:anchor>
-                  </w:drawing>
-                </mc:Choice>
-                <mc:Fallback>
-                  <w:pict>
-                    <v:rect id="shape_0" ID="Retângulo 1" path="m0,0l-2147483645,0l-2147483645,-2147483646l0,-2147483646xe" fillcolor="white" stroked="t" o:allowincell="f" style="position:absolute;margin-left:6.15pt;margin-top:10.4pt;width:11.95pt;height:10.15pt;mso-wrap-style:none;v-text-anchor:middle" wp14:anchorId="7A04F90E">
-                      <v:fill o:detectmouseclick="t" type="solid" color2="black"/>
-                      <v:stroke color="#4f81bd" weight="25560" joinstyle="round" endcap="flat"/>
-                      <w10:wrap type="none"/>
-                    </v:rect>
-                  </w:pict>
-                </mc:Fallback>
-              </mc:AlternateContent>
-              <mc:AlternateContent>
-                <mc:Choice Requires="wps">
-                  <w:drawing>
-                    <wp:anchor behindDoc="0" distT="12700" distB="12700" distL="12700" distR="12700" simplePos="0" locked="0" layoutInCell="1" allowOverlap="1" relativeHeight="16" wp14:anchorId="0360A5A0">
-                      <wp:simplePos x="0" y="0"/>
-                      <wp:positionH relativeFrom="column">
-                        <wp:posOffset>5057140</wp:posOffset>
-                      </wp:positionH>
-                      <wp:positionV relativeFrom="paragraph">
-                        <wp:posOffset>130810</wp:posOffset>
-                      </wp:positionV>
-                      <wp:extent cx="152400" cy="129540"/>
-                      <wp:effectExtent l="12700" t="12700" r="12700" b="12700"/>
-                      <wp:wrapNone/>
-                      <wp:docPr id="11" name="Retângulo 1"/>
-                      <a:graphic xmlns:a="http://schemas.openxmlformats.org/drawingml/2006/main">
-                        <a:graphicData uri="http://schemas.microsoft.com/office/word/2010/wordprocessingShape">
-                          <wps:wsp>
-                            <wps:cNvSpPr/>
-                            <wps:spPr>
-                              <a:xfrm>
-                                <a:off x="0" y="0"/>
-                                <a:ext cx="152280" cy="129600"/>
-                              </a:xfrm>
-                              <a:prstGeom prst="rect">
-                                <a:avLst/>
-                              </a:prstGeom>
-                              <a:solidFill>
-                                <a:srgbClr val="ffffff"/>
-                              </a:solidFill>
-                              <a:ln>
-                                <a:solidFill>
-                                  <a:srgbClr val="4f81bd"/>
-                                </a:solidFill>
-                                <a:round/>
-                              </a:ln>
-                            </wps:spPr>
-                            <wps:style>
-                              <a:lnRef idx="2">
-                                <a:schemeClr val="accent1"/>
-                              </a:lnRef>
-                              <a:fillRef idx="1">
-                                <a:schemeClr val="lt1"/>
-                              </a:fillRef>
-                              <a:effectRef idx="0">
-                                <a:schemeClr val="accent1"/>
-                              </a:effectRef>
-                              <a:fontRef idx="minor"/>
-                            </wps:style>
-                            <wps:bodyPr/>
-                          </wps:wsp>
-                        </a:graphicData>
-                      </a:graphic>
-                    </wp:anchor>
-                  </w:drawing>
-                </mc:Choice>
-                <mc:Fallback>
-                  <w:pict>
-                    <v:rect id="shape_0" ID="Retângulo 1" path="m0,0l-2147483645,0l-2147483645,-2147483646l0,-2147483646xe" fillcolor="white" stroked="t" o:allowincell="f" style="position:absolute;margin-left:398.2pt;margin-top:10.3pt;width:11.95pt;height:10.15pt;mso-wrap-style:none;v-text-anchor:middle" wp14:anchorId="0360A5A0">
-                      <v:fill o:detectmouseclick="t" type="solid" color2="black"/>
-                      <v:stroke color="#4f81bd" weight="25560" joinstyle="round" endcap="flat"/>
-                      <w10:wrap type="none"/>
-                    </v:rect>
-                  </w:pict>
-                </mc:Fallback>
-              </mc:AlternateContent>
-              <mc:AlternateContent>
-                <mc:Choice Requires="wps">
-                  <w:drawing>
-                    <wp:anchor behindDoc="0" distT="12700" distB="12700" distL="12700" distR="12700" simplePos="0" locked="0" layoutInCell="1" allowOverlap="1" relativeHeight="17" wp14:anchorId="0FE39464">
-                      <wp:simplePos x="0" y="0"/>
-                      <wp:positionH relativeFrom="column">
-                        <wp:posOffset>1490980</wp:posOffset>
-                      </wp:positionH>
-                      <wp:positionV relativeFrom="paragraph">
-                        <wp:posOffset>124460</wp:posOffset>
-                      </wp:positionV>
-                      <wp:extent cx="152400" cy="129540"/>
-                      <wp:effectExtent l="12700" t="12700" r="12700" b="12700"/>
-                      <wp:wrapNone/>
-                      <wp:docPr id="12" name="Retângulo 1"/>
-                      <a:graphic xmlns:a="http://schemas.openxmlformats.org/drawingml/2006/main">
-                        <a:graphicData uri="http://schemas.microsoft.com/office/word/2010/wordprocessingShape">
-                          <wps:wsp>
-                            <wps:cNvSpPr/>
-                            <wps:spPr>
-                              <a:xfrm>
-                                <a:off x="0" y="0"/>
-                                <a:ext cx="152280" cy="129600"/>
-                              </a:xfrm>
-                              <a:prstGeom prst="rect">
-                                <a:avLst/>
-                              </a:prstGeom>
-                              <a:solidFill>
-                                <a:srgbClr val="ffffff"/>
-                              </a:solidFill>
-                              <a:ln>
-                                <a:solidFill>
-                                  <a:srgbClr val="4f81bd"/>
-                                </a:solidFill>
-                                <a:round/>
-                              </a:ln>
-                            </wps:spPr>
-                            <wps:style>
-                              <a:lnRef idx="2">
-                                <a:schemeClr val="accent1"/>
-                              </a:lnRef>
-                              <a:fillRef idx="1">
-                                <a:schemeClr val="lt1"/>
-                              </a:fillRef>
-                              <a:effectRef idx="0">
-                                <a:schemeClr val="accent1"/>
-                              </a:effectRef>
-                              <a:fontRef idx="minor"/>
-                            </wps:style>
-                            <wps:bodyPr/>
-                          </wps:wsp>
-                        </a:graphicData>
-                      </a:graphic>
-                    </wp:anchor>
-                  </w:drawing>
-                </mc:Choice>
-                <mc:Fallback>
-                  <w:pict>
-                    <v:rect id="shape_0" ID="Retângulo 1" path="m0,0l-2147483645,0l-2147483645,-2147483646l0,-2147483646xe" fillcolor="white" stroked="t" o:allowincell="f" style="position:absolute;margin-left:117.4pt;margin-top:9.8pt;width:11.95pt;height:10.15pt;mso-wrap-style:none;v-text-anchor:middle" wp14:anchorId="0FE39464">
-                      <v:fill o:detectmouseclick="t" type="solid" color2="black"/>
-                      <v:stroke color="#4f81bd" weight="25560" joinstyle="round" endcap="flat"/>
-                      <w10:wrap type="none"/>
-                    </v:rect>
-                  </w:pict>
-                </mc:Fallback>
-              </mc:AlternateContent>
-            </w:r>
-          </w:p>
-          <w:p>
-            <w:pPr>
-              <w:pStyle w:val="Normal"/>
-              <w:widowControl/>
-              <w:suppressAutoHyphens w:val="true"/>
-              <w:spacing w:before="0" w:after="0"/>
-              <w:jc w:val="start"/>
-              <w:rPr>
-                <w:rFonts w:ascii="Arial" w:hAnsi="Arial" w:cs="Arial"/>
-                <w:sz w:val="18"/>
-                <w:szCs w:val="18"/>
-              </w:rPr>
-            </w:pPr>
-            <w:r>
-              <w:rPr>
-                <w:rFonts w:eastAsia="Times New Roman" w:cs="Arial" w:ascii="Arial" w:hAnsi="Arial"/>
-                <w:kern w:val="0"/>
-                <w:sz w:val="18"/>
-                <w:szCs w:val="18"/>
-                <w:lang w:val="pt-BR" w:eastAsia="pt-BR" w:bidi="ar-SA"/>
-              </w:rPr>
-              <w:t xml:space="preserve">         </w:t>
-            </w:r>
-            <w:r>
-              <w:rPr>
-                <w:rFonts w:eastAsia="Times New Roman" w:cs="Arial" w:ascii="Arial" w:hAnsi="Arial"/>
-                <w:kern w:val="0"/>
-                <w:sz w:val="18"/>
-                <w:szCs w:val="18"/>
-                <w:lang w:val="pt-BR" w:eastAsia="pt-BR" w:bidi="ar-SA"/>
-              </w:rPr>
-              <w:t>MESMO LOCAL                  OSSUÁRIO INDIVIDUAL                    OSSUÁRIO GERAL                    CREMATÓRIO</w:t>
-            </w:r>
-          </w:p>
-          <w:p>
-            <w:pPr>
-              <w:pStyle w:val="Normal"/>
-              <w:widowControl/>
-              <w:suppressAutoHyphens w:val="true"/>
-              <w:spacing w:before="0" w:after="0"/>
-              <w:jc w:val="start"/>
-              <w:rPr>
-                <w:rFonts w:ascii="Arial" w:hAnsi="Arial" w:cs="Arial"/>
-                <w:sz w:val="18"/>
-                <w:szCs w:val="18"/>
-              </w:rPr>
-            </w:pPr>
-            <w:r>
-              <w:rPr>
-                <w:rFonts w:cs="Arial" w:ascii="Arial" w:hAnsi="Arial"/>
-                <w:sz w:val="18"/>
-                <w:szCs w:val="18"/>
-              </w:rPr>
-            </w:r>
-          </w:p>
-          <w:p>
-            <w:pPr>
-              <w:pStyle w:val="Normal"/>
-              <w:widowControl/>
-              <w:suppressAutoHyphens w:val="true"/>
-              <w:spacing w:before="0" w:after="0"/>
-              <w:jc w:val="start"/>
-              <w:rPr>
-                <w:rFonts w:ascii="Arial" w:hAnsi="Arial" w:cs="Arial"/>
-                <w:sz w:val="18"/>
-                <w:szCs w:val="18"/>
-              </w:rPr>
-            </w:pPr>
-            <w:r>
-              <mc:AlternateContent>
-                <mc:Choice Requires="wps">
-                  <w:drawing>
-                    <wp:anchor behindDoc="0" distT="12700" distB="12700" distL="12700" distR="12700" simplePos="0" locked="0" layoutInCell="1" allowOverlap="1" relativeHeight="13" wp14:anchorId="6F9EAC43">
-                      <wp:simplePos x="0" y="0"/>
-                      <wp:positionH relativeFrom="column">
-                        <wp:posOffset>518795</wp:posOffset>
-                      </wp:positionH>
-                      <wp:positionV relativeFrom="paragraph">
-                        <wp:posOffset>1905</wp:posOffset>
-                      </wp:positionV>
-                      <wp:extent cx="152400" cy="129540"/>
-                      <wp:effectExtent l="12700" t="12700" r="12700" b="12700"/>
-                      <wp:wrapNone/>
-                      <wp:docPr id="13" name="Retângulo 1"/>
-                      <a:graphic xmlns:a="http://schemas.openxmlformats.org/drawingml/2006/main">
-                        <a:graphicData uri="http://schemas.microsoft.com/office/word/2010/wordprocessingShape">
-                          <wps:wsp>
-                            <wps:cNvSpPr/>
-                            <wps:spPr>
-                              <a:xfrm>
-                                <a:off x="0" y="0"/>
-                                <a:ext cx="152280" cy="129600"/>
-                              </a:xfrm>
-                              <a:prstGeom prst="rect">
-                                <a:avLst/>
-                              </a:prstGeom>
-                              <a:solidFill>
-                                <a:srgbClr val="ffffff"/>
-                              </a:solidFill>
-                              <a:ln>
-                                <a:solidFill>
-                                  <a:srgbClr val="4f81bd"/>
-                                </a:solidFill>
-                                <a:round/>
-                              </a:ln>
-                            </wps:spPr>
-                            <wps:style>
-                              <a:lnRef idx="2">
-                                <a:schemeClr val="accent1"/>
-                              </a:lnRef>
-                              <a:fillRef idx="1">
-                                <a:schemeClr val="lt1"/>
-                              </a:fillRef>
-                              <a:effectRef idx="0">
-                                <a:schemeClr val="accent1"/>
-                              </a:effectRef>
-                              <a:fontRef idx="minor"/>
-                            </wps:style>
-                            <wps:bodyPr/>
-                          </wps:wsp>
-                        </a:graphicData>
-                      </a:graphic>
-                    </wp:anchor>
-                  </w:drawing>
-                </mc:Choice>
-                <mc:Fallback>
-                  <w:pict>
-                    <v:rect id="shape_0" ID="Retângulo 1" path="m0,0l-2147483645,0l-2147483645,-2147483646l0,-2147483646xe" fillcolor="white" stroked="t" o:allowincell="f" style="position:absolute;margin-left:40.85pt;margin-top:0.15pt;width:11.95pt;height:10.15pt;mso-wrap-style:none;v-text-anchor:middle" wp14:anchorId="6F9EAC43">
-                      <v:fill o:detectmouseclick="t" type="solid" color2="black"/>
-                      <v:stroke color="#4f81bd" weight="25560" joinstyle="round" endcap="flat"/>
-                      <w10:wrap type="none"/>
-                    </v:rect>
-                  </w:pict>
-                </mc:Fallback>
-              </mc:AlternateContent>
-            </w:r>
-            <w:r>
-              <w:rPr>
-                <w:rFonts w:eastAsia="Times New Roman" w:cs="Arial" w:ascii="Arial" w:hAnsi="Arial"/>
-                <w:kern w:val="0"/>
-                <w:sz w:val="18"/>
-                <w:szCs w:val="18"/>
-                <w:lang w:val="pt-BR" w:eastAsia="pt-BR" w:bidi="ar-SA"/>
-              </w:rPr>
-              <w:t xml:space="preserve">                       </w:t>
-            </w:r>
-            <w:r>
-              <w:rPr>
-                <w:rFonts w:eastAsia="Times New Roman" w:cs="Arial" w:ascii="Arial" w:hAnsi="Arial"/>
-                <w:kern w:val="0"/>
-                <w:sz w:val="18"/>
-                <w:szCs w:val="18"/>
-                <w:lang w:val="pt-BR" w:eastAsia="pt-BR" w:bidi="ar-SA"/>
-              </w:rPr>
-              <w:t>TRANSLADADO   Local: ________________________________</w:t>
-            </w:r>
-          </w:p>
-          <w:p>
-            <w:pPr>
-              <w:pStyle w:val="Normal"/>
-              <w:widowControl/>
-              <w:suppressAutoHyphens w:val="true"/>
-              <w:spacing w:before="0" w:after="0"/>
-              <w:jc w:val="start"/>
-              <w:rPr>
-                <w:rFonts w:ascii="Arial" w:hAnsi="Arial" w:cs="Arial"/>
-                <w:b/>
-                <w:bCs/>
-                <w:sz w:val="18"/>
-                <w:szCs w:val="18"/>
-              </w:rPr>
-            </w:pPr>
-            <w:r>
-              <w:rPr>
-                <w:rFonts w:cs="Arial" w:ascii="Arial" w:hAnsi="Arial"/>
-                <w:b/>
-                <w:bCs/>
-                <w:sz w:val="18"/>
-                <w:szCs w:val="18"/>
-              </w:rPr>
-            </w:r>
-          </w:p>
-        </w:tc>
-      </w:tr>
-      <w:tr>
-        <w:trPr>
-          <w:trHeight w:val="228" w:hRule="atLeast"/>
-        </w:trPr>
-        <w:tc>
-          <w:tcPr>
-            <w:tcW w:w="10059" w:type="dxa"/>
-            <w:gridSpan w:val="8"/>
-            <w:tcBorders/>
-          </w:tcPr>
-          <w:p>
-            <w:pPr>
-              <w:pStyle w:val="Normal"/>
-              <w:widowControl/>
-              <w:suppressAutoHyphens w:val="true"/>
-              <w:spacing w:before="0" w:after="0"/>
-              <w:jc w:val="center"/>
-              <w:rPr>
-                <w:rFonts w:ascii="Arial" w:hAnsi="Arial" w:cs="Arial"/>
-                <w:b/>
-                <w:bCs/>
-              </w:rPr>
-            </w:pPr>
-            <w:r>
-              <w:rPr>
-                <w:rFonts w:eastAsia="Times New Roman" w:cs="Arial" w:ascii="Arial" w:hAnsi="Arial"/>
-                <w:b/>
-                <w:bCs/>
-                <w:kern w:val="0"/>
-                <w:sz w:val="20"/>
-                <w:szCs w:val="20"/>
-                <w:lang w:val="pt-BR" w:eastAsia="pt-BR" w:bidi="ar-SA"/>
-              </w:rPr>
-              <w:t>ADMINISTRAÇÃO</w:t>
-            </w:r>
-          </w:p>
-        </w:tc>
-      </w:tr>
-      <w:tr>
-        <w:trPr>
-          <w:trHeight w:val="802" w:hRule="atLeast"/>
+          <w:trHeight w:val="709" w:hRule="atLeast"/>
         </w:trPr>
         <w:tc>
           <w:tcPr>
@@ -2835,104 +1230,149 @@
             <w:gridSpan w:val="8"/>
             <w:tcBorders/>
             <w:vAlign w:val="center"/>
+            <w:tcMar>
+              <w:top w:w="40" w:type="dxa"/>
+              <w:start w:w="50" w:type="dxa"/>
+              <w:bottom w:w="40" w:type="dxa"/>
+              <w:end w:w="50" w:type="dxa"/>
+            </w:tcMar>
+          </w:tcPr>
+          <w:p>
+            <w:pPr>
+              <w:keepNext w:val="0"/>
+              <w:spacing w:before="0" w:after="0" w:line="240" w:lineRule="auto"/>
+              <w:jc w:val="center"/>
+            </w:pPr>
+            <w:r>
+              <w:rPr>
+                <w:rFonts w:ascii="Arial" w:hAnsi="Arial" w:eastAsia="Arial" w:cs="Arial"/>
+                <w:sz w:val="17"/>
+              </w:rPr>
+              <w:t>□ MESMO LOCAL      □ OSSUÁRIO INDIVIDUAL      □ OSSUÁRIO GERAL      □ CREMATÓRIO</w:t>
+            </w:r>
+          </w:p>
+          <w:p>
+            <w:pPr>
+              <w:keepNext w:val="0"/>
+              <w:spacing w:before="0" w:after="0" w:line="240" w:lineRule="auto"/>
+              <w:jc w:val="center"/>
+            </w:pPr>
+            <w:r>
+              <w:rPr>
+                <w:rFonts w:ascii="Arial" w:hAnsi="Arial" w:eastAsia="Arial" w:cs="Arial"/>
+                <w:sz w:val="17"/>
+              </w:rPr>
+              <w:t>□ TRANSLADADO    Local: ______________________________________________</w:t>
+            </w:r>
+          </w:p>
+          <w:p>
+            <w:pPr>
+              <w:keepNext w:val="0"/>
+              <w:spacing w:before="0" w:after="0" w:line="240" w:lineRule="auto"/>
+            </w:pPr>
+            <w:r>
+              <w:rPr>
+                <w:rFonts w:ascii="Arial" w:hAnsi="Arial" w:eastAsia="Arial" w:cs="Arial"/>
+                <w:sz w:val="17"/>
+              </w:rPr>
+              <w:t>Obs.: __________________________________________________________________________________</w:t>
+            </w:r>
+          </w:p>
+          <w:p>
+            <w:pPr>
+              <w:keepNext w:val="0"/>
+              <w:spacing w:before="0" w:after="0" w:line="240" w:lineRule="auto"/>
+            </w:pPr>
+            <w:r>
+              <w:rPr>
+                <w:rFonts w:ascii="Arial" w:hAnsi="Arial" w:eastAsia="Arial" w:cs="Arial"/>
+                <w:sz w:val="17"/>
+              </w:rPr>
+              <w:t>_______________________________________________________________________________________</w:t>
+            </w:r>
+          </w:p>
+        </w:tc>
+      </w:tr>
+      <w:tr>
+        <w:trPr>
+          <w:trHeight w:val="227" w:hRule="atLeast"/>
+        </w:trPr>
+        <w:tc>
+          <w:tcPr>
+            <w:tcW w:w="10059" w:type="dxa"/>
+            <w:gridSpan w:val="8"/>
+            <w:tcBorders/>
+            <w:tcMar>
+              <w:top w:w="40" w:type="dxa"/>
+              <w:start w:w="50" w:type="dxa"/>
+              <w:bottom w:w="40" w:type="dxa"/>
+              <w:end w:w="50" w:type="dxa"/>
+            </w:tcMar>
+            <w:vAlign w:val="center"/>
           </w:tcPr>
           <w:p>
             <w:pPr>
               <w:pStyle w:val="Normal"/>
+              <w:keepNext w:val="0"/>
               <w:widowControl/>
               <w:suppressAutoHyphens w:val="true"/>
-              <w:spacing w:before="0" w:after="0"/>
-              <w:jc w:val="center"/>
-              <w:rPr>
-                <w:rFonts w:ascii="Arial" w:hAnsi="Arial" w:cs="Arial"/>
-                <w:sz w:val="18"/>
-                <w:szCs w:val="18"/>
-              </w:rPr>
-            </w:pPr>
-            <w:r>
-              <w:rPr>
-                <w:rFonts w:cs="Arial" w:ascii="Arial" w:hAnsi="Arial"/>
-                <w:sz w:val="18"/>
-                <w:szCs w:val="18"/>
-              </w:rPr>
-            </w:r>
-          </w:p>
-          <w:p>
-            <w:pPr>
-              <w:pStyle w:val="Normal"/>
-              <w:widowControl/>
-              <w:suppressAutoHyphens w:val="true"/>
-              <w:spacing w:before="0" w:after="0"/>
+              <w:spacing w:before="0" w:after="0" w:line="240" w:lineRule="auto"/>
               <w:jc w:val="center"/>
               <w:rPr>
                 <w:rFonts w:ascii="Arial" w:hAnsi="Arial" w:cs="Arial"/>
                 <w:b/>
                 <w:bCs/>
-                <w:sz w:val="16"/>
-                <w:szCs w:val="16"/>
               </w:rPr>
             </w:pPr>
             <w:r>
               <w:rPr>
-                <w:rFonts w:cs="Arial" w:ascii="Arial" w:hAnsi="Arial"/>
+                <w:rFonts w:ascii="Arial" w:hAnsi="Arial" w:eastAsia="Arial" w:cs="Arial"/>
                 <w:b/>
-                <w:bCs/>
-                <w:sz w:val="16"/>
-                <w:szCs w:val="16"/>
-              </w:rPr>
+                <w:sz w:val="18"/>
+              </w:rPr>
+              <w:t>ADMINISTRAÇÃO</w:t>
             </w:r>
           </w:p>
+        </w:tc>
+      </w:tr>
+      <w:tr>
+        <w:trPr>
+          <w:trHeight w:val="397" w:hRule="atLeast"/>
+        </w:trPr>
+        <w:tc>
+          <w:tcPr>
+            <w:tcW w:w="10059" w:type="dxa"/>
+            <w:gridSpan w:val="8"/>
+            <w:tcBorders/>
+            <w:vAlign w:val="center"/>
+            <w:tcMar>
+              <w:top w:w="40" w:type="dxa"/>
+              <w:start w:w="50" w:type="dxa"/>
+              <w:bottom w:w="40" w:type="dxa"/>
+              <w:end w:w="50" w:type="dxa"/>
+            </w:tcMar>
+          </w:tcPr>
           <w:p>
             <w:pPr>
-              <w:pStyle w:val="Normal"/>
-              <w:widowControl/>
-              <w:suppressAutoHyphens w:val="true"/>
-              <w:spacing w:before="0" w:after="0"/>
+              <w:keepNext w:val="0"/>
+              <w:spacing w:before="0" w:after="0" w:line="240" w:lineRule="auto"/>
               <w:jc w:val="center"/>
-              <w:rPr>
-                <w:rFonts w:ascii="Arial" w:hAnsi="Arial" w:cs="Arial"/>
+            </w:pPr>
+            <w:r>
+              <w:rPr>
+                <w:rFonts w:ascii="Arial" w:hAnsi="Arial" w:eastAsia="Arial" w:cs="Arial"/>
+                <w:sz w:val="17"/>
+              </w:rPr>
+              <w:t xml:space="preserve">Assinatura da Administração: __________________________    Data: </w:t>
+            </w:r>
+            <w:r>
+              <w:rPr>
+                <w:rFonts w:ascii="Arial" w:hAnsi="Arial" w:eastAsia="Arial" w:cs="Arial"/>
                 <w:b/>
-                <w:bCs/>
-                <w:sz w:val="16"/>
-                <w:szCs w:val="16"/>
-              </w:rPr>
-            </w:pPr>
-            <w:r>
-              <w:rPr>
-                <w:rFonts w:eastAsia="Times New Roman" w:cs="Arial" w:ascii="Arial" w:hAnsi="Arial"/>
-                <w:b/>
-                <w:bCs/>
-                <w:kern w:val="0"/>
-                <w:sz w:val="20"/>
-                <w:szCs w:val="20"/>
-                <w:lang w:val="pt-BR" w:eastAsia="pt-BR" w:bidi="ar-SA"/>
-              </w:rPr>
-              <w:t>Assinatura da Administração: __________________________ {{dataAtual}}</w:t>
-            </w:r>
-          </w:p>
-          <w:p>
-            <w:pPr>
-              <w:pStyle w:val="Normal"/>
-              <w:widowControl/>
-              <w:suppressAutoHyphens w:val="true"/>
-              <w:spacing w:before="0" w:after="0"/>
-              <w:jc w:val="center"/>
-              <w:rPr>
-                <w:rFonts w:ascii="Arial" w:hAnsi="Arial" w:cs="Arial"/>
-                <w:b/>
-                <w:bCs/>
-              </w:rPr>
-            </w:pPr>
-            <w:r>
-              <w:rPr>
-                <w:rFonts w:cs="Arial" w:ascii="Arial" w:hAnsi="Arial"/>
-                <w:b/>
-                <w:bCs/>
-              </w:rPr>
-            </w:r>
-            <w:bookmarkStart w:id="3" w:name="_Hlk191540197"/>
-            <w:bookmarkStart w:id="4" w:name="_Hlk191540197"/>
-            <w:bookmarkEnd w:id="4"/>
+                <w:sz w:val="17"/>
+              </w:rPr>
+              <w:t>{dataAtual}</w:t>
+            </w:r>
           </w:p>
         </w:tc>
       </w:tr>
@@ -4268,10 +2708,10 @@
       <w:jc w:val="start"/>
     </w:pPr>
     <w:rPr>
-      <w:rFonts w:ascii="Tahoma" w:hAnsi="Tahoma" w:eastAsia="Times New Roman" w:cs="Times New Roman"/>
+      <w:rFonts w:ascii="Arial" w:hAnsi="Arial" w:eastAsia="Arial" w:cs="Times New Roman"/>
       <w:color w:val="auto"/>
       <w:kern w:val="0"/>
-      <w:sz w:val="20"/>
+      <w:sz w:val="18"/>
       <w:szCs w:val="20"/>
       <w:lang w:val="pt-BR" w:eastAsia="pt-BR" w:bidi="ar-SA"/>
     </w:rPr>

</xml_diff>